<commit_message>
Add tcc-zenardi.pdf document to the project
</commit_message>
<xml_diff>
--- a/tcc-zenardi.docx
+++ b/tcc-zenardi.docx
@@ -1031,19 +1031,7 @@
         <w:rPr>
           <w:rStyle w:val="citation-708"/>
         </w:rPr>
-        <w:t>A arquitetura d</w:t>
-      </w:r>
-      <w:r>
-        <w:rPr>
-          <w:rStyle w:val="citation-708"/>
-        </w:rPr>
-        <w:t>o</w:t>
-      </w:r>
-      <w:r>
-        <w:rPr>
-          <w:rStyle w:val="citation-708"/>
-        </w:rPr>
-        <w:t xml:space="preserve"> Internal Developer Platform (IDP) será baseada no princípio de separação de responsabilidades, garantindo baixo acoplamento e alta coesão</w:t>
+        <w:t>A arquitetura do Internal Developer Platform (IDP) será baseada no princípio de separação de responsabilidades, garantindo baixo acoplamento e alta coesão</w:t>
       </w:r>
       <w:r>
         <w:t>. A plataforma será dividida em quatro camadas principais independentes:</w:t>
@@ -1255,24 +1243,14 @@
       <w:r>
         <w:t xml:space="preserve">Figura </w:t>
       </w:r>
-      <w:r>
-        <w:fldChar w:fldCharType="begin"/>
-      </w:r>
-      <w:r>
-        <w:instrText xml:space="preserve"> SEQ Figura \* ARABIC </w:instrText>
-      </w:r>
-      <w:r>
-        <w:fldChar w:fldCharType="separate"/>
-      </w:r>
-      <w:r>
-        <w:rPr>
-          <w:noProof/>
-        </w:rPr>
-        <w:t>1</w:t>
-      </w:r>
-      <w:r>
-        <w:fldChar w:fldCharType="end"/>
-      </w:r>
+      <w:fldSimple w:instr=" SEQ Figura \* ARABIC ">
+        <w:r>
+          <w:rPr>
+            <w:noProof/>
+          </w:rPr>
+          <w:t>1</w:t>
+        </w:r>
+      </w:fldSimple>
       <w:r>
         <w:t xml:space="preserve">: </w:t>
       </w:r>
@@ -2380,6 +2358,7 @@
                 <w:color w:val="839496"/>
                 <w:sz w:val="18"/>
                 <w:szCs w:val="18"/>
+                <w:lang w:val="en-US"/>
               </w:rPr>
               <w:t xml:space="preserve">        </w:t>
             </w:r>
@@ -2764,21 +2743,7 @@
           <w:b/>
           <w:bCs/>
         </w:rPr>
-        <w:t xml:space="preserve">Risco 1: </w:t>
-      </w:r>
-      <w:r>
-        <w:rPr>
-          <w:b/>
-          <w:bCs/>
-        </w:rPr>
-        <w:t>O</w:t>
-      </w:r>
-      <w:r>
-        <w:rPr>
-          <w:b/>
-          <w:bCs/>
-        </w:rPr>
-        <w:t xml:space="preserve"> IDP se tornar um Ponto Único de Falha (SPOF).</w:t>
+        <w:t>Risco 1: O IDP se tornar um Ponto Único de Falha (SPOF).</w:t>
       </w:r>
       <w:r>
         <w:t xml:space="preserve"> </w:t>
@@ -2833,13 +2798,7 @@
         <w:t>Mitigação:</w:t>
       </w:r>
       <w:r>
-        <w:t xml:space="preserve"> Tratar </w:t>
-      </w:r>
-      <w:r>
-        <w:t>o</w:t>
-      </w:r>
-      <w:r>
-        <w:t xml:space="preserve"> IDP como um produto (</w:t>
+        <w:t xml:space="preserve"> Tratar o IDP como um produto (</w:t>
       </w:r>
       <w:r>
         <w:rPr>
@@ -3887,6 +3846,7 @@
         <w:docPartUnique/>
       </w:docPartObj>
     </w:sdtPr>
+    <w:sdtEndPr/>
     <w:sdtContent>
       <w:p>
         <w:pPr>
@@ -3965,7 +3925,7 @@
         <w:noProof/>
         <w:lang w:eastAsia="pt-BR"/>
       </w:rPr>
-      <w:pict w14:anchorId="441BE1C7">
+      <w:pict w14:anchorId="65587900">
         <v:shapetype id="_x0000_t75" coordsize="21600,21600" o:spt="75" o:preferrelative="t" path="m@4@5l@4@11@9@11@9@5xe" filled="f" stroked="f">
           <v:stroke joinstyle="miter"/>
           <v:formulas>
@@ -4028,7 +3988,7 @@
         <w:noProof/>
         <w:lang w:eastAsia="pt-BR"/>
       </w:rPr>
-      <w:pict w14:anchorId="0ADB9F5B">
+      <w:pict w14:anchorId="3A69EE50">
         <v:shapetype id="_x0000_t75" coordsize="21600,21600" o:spt="75" o:preferrelative="t" path="m@4@5l@4@11@9@11@9@5xe" filled="f" stroked="f">
           <v:stroke joinstyle="miter"/>
           <v:formulas>
@@ -4966,6 +4926,7 @@
   <w:style w:type="character" w:default="1" w:styleId="DefaultParagraphFont">
     <w:name w:val="Default Paragraph Font"/>
     <w:uiPriority w:val="1"/>
+    <w:semiHidden/>
     <w:unhideWhenUsed/>
   </w:style>
   <w:style w:type="table" w:default="1" w:styleId="TableNormal">
@@ -5568,18 +5529,18 @@
 </file>
 
 <file path=customXml/item1.xml><?xml version="1.0" encoding="utf-8"?>
-<p:properties xmlns:p="http://schemas.microsoft.com/office/2006/metadata/properties" xmlns:xsi="http://www.w3.org/2001/XMLSchema-instance" xmlns:pc="http://schemas.microsoft.com/office/infopath/2007/PartnerControls">
-  <documentManagement/>
-</p:properties>
-</file>
-
-<file path=customXml/item2.xml><?xml version="1.0" encoding="utf-8"?>
 <?mso-contentType ?>
 <FormTemplates xmlns="http://schemas.microsoft.com/sharepoint/v3/contenttype/forms">
   <Display>DocumentLibraryForm</Display>
   <Edit>DocumentLibraryForm</Edit>
   <New>DocumentLibraryForm</New>
 </FormTemplates>
+</file>
+
+<file path=customXml/item2.xml><?xml version="1.0" encoding="utf-8"?>
+<p:properties xmlns:p="http://schemas.microsoft.com/office/2006/metadata/properties" xmlns:xsi="http://www.w3.org/2001/XMLSchema-instance" xmlns:pc="http://schemas.microsoft.com/office/infopath/2007/PartnerControls">
+  <documentManagement/>
+</p:properties>
 </file>
 
 <file path=customXml/item3.xml><?xml version="1.0" encoding="utf-8"?>
@@ -5800,18 +5761,18 @@
 </file>
 
 <file path=customXml/itemProps1.xml><?xml version="1.0" encoding="utf-8"?>
-<ds:datastoreItem xmlns:ds="http://schemas.openxmlformats.org/officeDocument/2006/customXml" ds:itemID="{6F6DFC47-F813-4586-A92E-F921BCC2C8CD}">
+<ds:datastoreItem xmlns:ds="http://schemas.openxmlformats.org/officeDocument/2006/customXml" ds:itemID="{A080799D-B01C-4216-9B7C-7DA6FA8AF4E8}">
   <ds:schemaRefs>
-    <ds:schemaRef ds:uri="http://schemas.microsoft.com/office/2006/metadata/properties"/>
-    <ds:schemaRef ds:uri="http://schemas.microsoft.com/office/infopath/2007/PartnerControls"/>
+    <ds:schemaRef ds:uri="http://schemas.microsoft.com/sharepoint/v3/contenttype/forms"/>
   </ds:schemaRefs>
 </ds:datastoreItem>
 </file>
 
 <file path=customXml/itemProps2.xml><?xml version="1.0" encoding="utf-8"?>
-<ds:datastoreItem xmlns:ds="http://schemas.openxmlformats.org/officeDocument/2006/customXml" ds:itemID="{A080799D-B01C-4216-9B7C-7DA6FA8AF4E8}">
+<ds:datastoreItem xmlns:ds="http://schemas.openxmlformats.org/officeDocument/2006/customXml" ds:itemID="{6F6DFC47-F813-4586-A92E-F921BCC2C8CD}">
   <ds:schemaRefs>
-    <ds:schemaRef ds:uri="http://schemas.microsoft.com/sharepoint/v3/contenttype/forms"/>
+    <ds:schemaRef ds:uri="http://schemas.microsoft.com/office/2006/metadata/properties"/>
+    <ds:schemaRef ds:uri="http://schemas.microsoft.com/office/infopath/2007/PartnerControls"/>
   </ds:schemaRefs>
 </ds:datastoreItem>
 </file>

</xml_diff>

<commit_message>
Remove outdated feedback document and update project PDF
</commit_message>
<xml_diff>
--- a/tcc-zenardi.docx
+++ b/tcc-zenardi.docx
@@ -1246,8 +1246,6 @@
         <w:contextualSpacing/>
         <w:rPr>
           <w:rFonts w:ascii="Times New Roman" w:hAnsi="Times New Roman" w:cs="Times New Roman"/>
-          <w:b/>
-          <w:bCs/>
           <w:sz w:val="24"/>
           <w:szCs w:val="24"/>
           <w:lang w:val="en-BR"/>
@@ -1278,16 +1276,7 @@
           <w:szCs w:val="24"/>
           <w:lang w:val="en-BR"/>
         </w:rPr>
-        <w:t>Ciclo DevSecOps e Segurança (Cybersecurity)</w:t>
-      </w:r>
-      <w:r>
-        <w:rPr>
-          <w:rFonts w:ascii="Times New Roman" w:hAnsi="Times New Roman" w:cs="Times New Roman"/>
-          <w:sz w:val="24"/>
-          <w:szCs w:val="24"/>
-          <w:lang w:val="en-BR"/>
-        </w:rPr>
-        <w:t xml:space="preserve"> </w:t>
+        <w:t>Mecanismos de Controle e Governança de IA</w:t>
       </w:r>
     </w:p>
     <w:p>
@@ -1327,7 +1316,7 @@
           <w:szCs w:val="24"/>
           <w:lang w:val="en-BR"/>
         </w:rPr>
-        <w:t xml:space="preserve">A adoção do IDP e dos </w:t>
+        <w:t xml:space="preserve">Ao utilizar um </w:t>
       </w:r>
       <w:r>
         <w:rPr>
@@ -1338,16 +1327,16 @@
           <w:szCs w:val="24"/>
           <w:lang w:val="en-BR"/>
         </w:rPr>
-        <w:t>Golden Paths</w:t>
-      </w:r>
-      <w:r>
-        <w:rPr>
-          <w:rFonts w:ascii="Times New Roman" w:hAnsi="Times New Roman" w:cs="Times New Roman"/>
-          <w:sz w:val="24"/>
-          <w:szCs w:val="24"/>
-          <w:lang w:val="en-BR"/>
-        </w:rPr>
-        <w:t xml:space="preserve"> é o alicerce para materializar o ciclo DevSecOps. Ao invés de a segurança ser um gargalo no final do desenvolvimento, ela é injetada na origem (</w:t>
+        <w:t>Software Template</w:t>
+      </w:r>
+      <w:r>
+        <w:rPr>
+          <w:rFonts w:ascii="Times New Roman" w:hAnsi="Times New Roman" w:cs="Times New Roman"/>
+          <w:sz w:val="24"/>
+          <w:szCs w:val="24"/>
+          <w:lang w:val="en-BR"/>
+        </w:rPr>
+        <w:t xml:space="preserve"> para criar um novo projeto, o IDP injeta automaticamente na raiz do repositório arquivos de instruções específicas (como </w:t>
       </w:r>
       <w:r>
         <w:rPr>
@@ -1358,16 +1347,16 @@
           <w:szCs w:val="24"/>
           <w:lang w:val="en-BR"/>
         </w:rPr>
-        <w:t>Shift-Left</w:t>
-      </w:r>
-      <w:r>
-        <w:rPr>
-          <w:rFonts w:ascii="Times New Roman" w:hAnsi="Times New Roman" w:cs="Times New Roman"/>
-          <w:sz w:val="24"/>
-          <w:szCs w:val="24"/>
-          <w:lang w:val="en-BR"/>
-        </w:rPr>
-        <w:t xml:space="preserve">). O uso obrigatório de imagens de contêiner </w:t>
+        <w:t>AGENT.md</w:t>
+      </w:r>
+      <w:r>
+        <w:rPr>
+          <w:rFonts w:ascii="Times New Roman" w:hAnsi="Times New Roman" w:cs="Times New Roman"/>
+          <w:sz w:val="24"/>
+          <w:szCs w:val="24"/>
+          <w:lang w:val="en-BR"/>
+        </w:rPr>
+        <w:t xml:space="preserve"> ou </w:t>
       </w:r>
       <w:r>
         <w:rPr>
@@ -1378,16 +1367,49 @@
           <w:szCs w:val="24"/>
           <w:lang w:val="en-BR"/>
         </w:rPr>
-        <w:t>distroless</w:t>
-      </w:r>
-      <w:r>
-        <w:rPr>
-          <w:rFonts w:ascii="Times New Roman" w:hAnsi="Times New Roman" w:cs="Times New Roman"/>
-          <w:sz w:val="24"/>
-          <w:szCs w:val="24"/>
-          <w:lang w:val="en-BR"/>
-        </w:rPr>
-        <w:t xml:space="preserve"> da Chainguard é um exemplo prático dessa governança: os projetos já nascem livres de vulnerabilidades conhecidas e sem </w:t>
+        <w:t>.github/copilot-instructions.md</w:t>
+      </w:r>
+      <w:r>
+        <w:rPr>
+          <w:rFonts w:ascii="Times New Roman" w:hAnsi="Times New Roman" w:cs="Times New Roman"/>
+          <w:sz w:val="24"/>
+          <w:szCs w:val="24"/>
+          <w:lang w:val="en-BR"/>
+        </w:rPr>
+        <w:t>).</w:t>
+      </w:r>
+    </w:p>
+    <w:p>
+      <w:pPr>
+        <w:tabs>
+          <w:tab w:val="center" w:pos="4252"/>
+          <w:tab w:val="right" w:pos="8504"/>
+        </w:tabs>
+        <w:contextualSpacing/>
+        <w:rPr>
+          <w:rFonts w:ascii="Times New Roman" w:hAnsi="Times New Roman" w:cs="Times New Roman"/>
+          <w:sz w:val="24"/>
+          <w:szCs w:val="24"/>
+          <w:lang w:val="en-BR"/>
+        </w:rPr>
+      </w:pPr>
+      <w:r>
+        <w:rPr>
+          <w:rFonts w:ascii="Times New Roman" w:hAnsi="Times New Roman" w:cs="Times New Roman"/>
+          <w:sz w:val="24"/>
+          <w:szCs w:val="24"/>
+          <w:lang w:val="en-BR"/>
+        </w:rPr>
+        <w:t xml:space="preserve">Esses arquivos definem </w:t>
+      </w:r>
+      <w:r>
+        <w:rPr>
+          <w:rFonts w:ascii="Times New Roman" w:hAnsi="Times New Roman" w:cs="Times New Roman"/>
+          <w:sz w:val="24"/>
+          <w:szCs w:val="24"/>
+          <w:lang w:val="en-BR"/>
+        </w:rPr>
+        <w:t xml:space="preserve">um </w:t>
       </w:r>
       <w:r>
         <w:rPr>
@@ -1396,18 +1418,43 @@
           <w:iCs/>
           <w:sz w:val="24"/>
           <w:szCs w:val="24"/>
-          <w:lang w:val="en-BR"/>
-        </w:rPr>
-        <w:t>shells</w:t>
-      </w:r>
-      <w:r>
-        <w:rPr>
-          <w:rFonts w:ascii="Times New Roman" w:hAnsi="Times New Roman" w:cs="Times New Roman"/>
-          <w:sz w:val="24"/>
-          <w:szCs w:val="24"/>
-          <w:lang w:val="en-BR"/>
-        </w:rPr>
-        <w:t xml:space="preserve"> (CHAINGUARD, 2026). Complementarmente, o Kyverno atua como motor de </w:t>
+        </w:rPr>
+        <w:t>prompt</w:t>
+      </w:r>
+      <w:r>
+        <w:rPr>
+          <w:rFonts w:ascii="Times New Roman" w:hAnsi="Times New Roman" w:cs="Times New Roman"/>
+          <w:sz w:val="24"/>
+          <w:szCs w:val="24"/>
+        </w:rPr>
+        <w:t xml:space="preserve"> de sistema, fornecendo contexto adicional e regras de codificação </w:t>
+      </w:r>
+      <w:r>
+        <w:rPr>
+          <w:rFonts w:ascii="Times New Roman" w:hAnsi="Times New Roman" w:cs="Times New Roman"/>
+          <w:sz w:val="24"/>
+          <w:szCs w:val="24"/>
+          <w:lang w:val="en-BR"/>
+        </w:rPr>
+        <w:t>para</w:t>
+      </w:r>
+      <w:r>
+        <w:rPr>
+          <w:rFonts w:ascii="Times New Roman" w:hAnsi="Times New Roman" w:cs="Times New Roman"/>
+          <w:sz w:val="24"/>
+          <w:szCs w:val="24"/>
+          <w:lang w:val="en-BR"/>
+        </w:rPr>
+        <w:t xml:space="preserve"> que</w:t>
+      </w:r>
+      <w:r>
+        <w:rPr>
+          <w:rFonts w:ascii="Times New Roman" w:hAnsi="Times New Roman" w:cs="Times New Roman"/>
+          <w:sz w:val="24"/>
+          <w:szCs w:val="24"/>
+          <w:lang w:val="en-BR"/>
+        </w:rPr>
+        <w:t xml:space="preserve"> assistentes como </w:t>
       </w:r>
       <w:r>
         <w:rPr>
@@ -1418,16 +1465,16 @@
           <w:szCs w:val="24"/>
           <w:lang w:val="en-BR"/>
         </w:rPr>
-        <w:t>Policy as Code</w:t>
-      </w:r>
-      <w:r>
-        <w:rPr>
-          <w:rFonts w:ascii="Times New Roman" w:hAnsi="Times New Roman" w:cs="Times New Roman"/>
-          <w:sz w:val="24"/>
-          <w:szCs w:val="24"/>
-          <w:lang w:val="en-BR"/>
-        </w:rPr>
-        <w:t xml:space="preserve">, bloqueando implantações fora do padrão (KYVERNO, 2026), e o </w:t>
+        <w:t>GitHub Copilot</w:t>
+      </w:r>
+      <w:r>
+        <w:rPr>
+          <w:rFonts w:ascii="Times New Roman" w:hAnsi="Times New Roman" w:cs="Times New Roman"/>
+          <w:sz w:val="24"/>
+          <w:szCs w:val="24"/>
+          <w:lang w:val="en-BR"/>
+        </w:rPr>
+        <w:t xml:space="preserve"> ou </w:t>
       </w:r>
       <w:r>
         <w:rPr>
@@ -1438,16 +1485,137 @@
           <w:szCs w:val="24"/>
           <w:lang w:val="en-BR"/>
         </w:rPr>
-        <w:t>Azure Key Vault</w:t>
-      </w:r>
-      <w:r>
-        <w:rPr>
-          <w:rFonts w:ascii="Times New Roman" w:hAnsi="Times New Roman" w:cs="Times New Roman"/>
-          <w:sz w:val="24"/>
-          <w:szCs w:val="24"/>
-          <w:lang w:val="en-BR"/>
-        </w:rPr>
-        <w:t xml:space="preserve"> gerencia segredos de forma segura via </w:t>
+        <w:t>Azure OpenAI</w:t>
+      </w:r>
+      <w:r>
+        <w:rPr>
+          <w:rFonts w:ascii="Times New Roman" w:hAnsi="Times New Roman" w:cs="Times New Roman"/>
+          <w:sz w:val="24"/>
+          <w:szCs w:val="24"/>
+          <w:lang w:val="en-BR"/>
+        </w:rPr>
+        <w:t xml:space="preserve"> </w:t>
+      </w:r>
+      <w:r>
+        <w:rPr>
+          <w:rFonts w:ascii="Times New Roman" w:hAnsi="Times New Roman" w:cs="Times New Roman"/>
+          <w:sz w:val="24"/>
+          <w:szCs w:val="24"/>
+        </w:rPr>
+        <w:t>apli</w:t>
+      </w:r>
+      <w:r>
+        <w:rPr>
+          <w:rFonts w:ascii="Times New Roman" w:hAnsi="Times New Roman" w:cs="Times New Roman"/>
+          <w:sz w:val="24"/>
+          <w:szCs w:val="24"/>
+        </w:rPr>
+        <w:t>quem</w:t>
+      </w:r>
+      <w:r>
+        <w:rPr>
+          <w:rFonts w:ascii="Times New Roman" w:hAnsi="Times New Roman" w:cs="Times New Roman"/>
+          <w:sz w:val="24"/>
+          <w:szCs w:val="24"/>
+        </w:rPr>
+        <w:t xml:space="preserve"> automaticamente em todas as interações de chat e geração de código no repositório.</w:t>
+      </w:r>
+      <w:r>
+        <w:rPr>
+          <w:rFonts w:ascii="Times New Roman" w:hAnsi="Times New Roman" w:cs="Times New Roman"/>
+          <w:sz w:val="24"/>
+          <w:szCs w:val="24"/>
+          <w:lang w:val="en-BR"/>
+        </w:rPr>
+        <w:t xml:space="preserve"> Neste arquivo é </w:t>
+      </w:r>
+      <w:r>
+        <w:rPr>
+          <w:rFonts w:ascii="Times New Roman" w:hAnsi="Times New Roman" w:cs="Times New Roman"/>
+          <w:sz w:val="24"/>
+          <w:szCs w:val="24"/>
+          <w:lang w:val="en-BR"/>
+        </w:rPr>
+        <w:t>especificado:</w:t>
+      </w:r>
+    </w:p>
+    <w:p>
+      <w:pPr>
+        <w:tabs>
+          <w:tab w:val="center" w:pos="4252"/>
+          <w:tab w:val="right" w:pos="8504"/>
+        </w:tabs>
+        <w:contextualSpacing/>
+        <w:rPr>
+          <w:rFonts w:ascii="Times New Roman" w:hAnsi="Times New Roman" w:cs="Times New Roman"/>
+          <w:sz w:val="24"/>
+          <w:szCs w:val="24"/>
+          <w:lang w:val="en-BR"/>
+        </w:rPr>
+      </w:pPr>
+    </w:p>
+    <w:p>
+      <w:pPr>
+        <w:pStyle w:val="ListParagraph"/>
+        <w:numPr>
+          <w:ilvl w:val="0"/>
+          <w:numId w:val="18"/>
+        </w:numPr>
+        <w:tabs>
+          <w:tab w:val="center" w:pos="4252"/>
+          <w:tab w:val="right" w:pos="8504"/>
+        </w:tabs>
+        <w:rPr>
+          <w:rFonts w:ascii="Times New Roman" w:hAnsi="Times New Roman" w:cs="Times New Roman"/>
+          <w:sz w:val="24"/>
+          <w:szCs w:val="24"/>
+          <w:lang w:val="en-BR"/>
+        </w:rPr>
+      </w:pPr>
+      <w:r>
+        <w:rPr>
+          <w:rFonts w:ascii="Times New Roman" w:hAnsi="Times New Roman" w:cs="Times New Roman"/>
+          <w:sz w:val="24"/>
+          <w:szCs w:val="24"/>
+          <w:lang w:val="en-BR"/>
+        </w:rPr>
+        <w:t>As versões de bibliotecas aprovadas pela segurança;</w:t>
+      </w:r>
+    </w:p>
+    <w:p>
+      <w:pPr>
+        <w:pStyle w:val="ListParagraph"/>
+        <w:numPr>
+          <w:ilvl w:val="0"/>
+          <w:numId w:val="18"/>
+        </w:numPr>
+        <w:tabs>
+          <w:tab w:val="center" w:pos="4252"/>
+          <w:tab w:val="right" w:pos="8504"/>
+        </w:tabs>
+        <w:rPr>
+          <w:rFonts w:ascii="Times New Roman" w:hAnsi="Times New Roman" w:cs="Times New Roman"/>
+          <w:sz w:val="24"/>
+          <w:szCs w:val="24"/>
+          <w:lang w:val="en-BR"/>
+        </w:rPr>
+      </w:pPr>
+      <w:r>
+        <w:rPr>
+          <w:rFonts w:ascii="Times New Roman" w:hAnsi="Times New Roman" w:cs="Times New Roman"/>
+          <w:sz w:val="24"/>
+          <w:szCs w:val="24"/>
+          <w:lang w:val="en-BR"/>
+        </w:rPr>
+        <w:t>O processo de desenvolvimento que a IA deve adotar (e.g.</w:t>
+      </w:r>
+      <w:r>
+        <w:rPr>
+          <w:rFonts w:ascii="Times New Roman" w:hAnsi="Times New Roman" w:cs="Times New Roman"/>
+          <w:sz w:val="24"/>
+          <w:szCs w:val="24"/>
+        </w:rPr>
+        <w:t xml:space="preserve">: </w:t>
       </w:r>
       <w:r>
         <w:rPr>
@@ -1456,57 +1624,171 @@
           <w:iCs/>
           <w:sz w:val="24"/>
           <w:szCs w:val="24"/>
-          <w:lang w:val="en-BR"/>
-        </w:rPr>
-        <w:t>CSI Driver</w:t>
-      </w:r>
-      <w:r>
-        <w:rPr>
-          <w:rFonts w:ascii="Times New Roman" w:hAnsi="Times New Roman" w:cs="Times New Roman"/>
-          <w:sz w:val="24"/>
-          <w:szCs w:val="24"/>
-          <w:lang w:val="en-BR"/>
-        </w:rPr>
-        <w:t xml:space="preserve"> (MICROSOFT, 2026b).</w:t>
-      </w:r>
-    </w:p>
-    <w:p>
-      <w:pPr>
+        </w:rPr>
+        <w:t>Test Driven Development</w:t>
+      </w:r>
+      <w:r>
+        <w:rPr>
+          <w:rFonts w:ascii="Times New Roman" w:hAnsi="Times New Roman" w:cs="Times New Roman"/>
+          <w:sz w:val="24"/>
+          <w:szCs w:val="24"/>
+        </w:rPr>
+        <w:t xml:space="preserve"> – TDD);</w:t>
+      </w:r>
+    </w:p>
+    <w:p>
+      <w:pPr>
+        <w:pStyle w:val="ListParagraph"/>
+        <w:numPr>
+          <w:ilvl w:val="0"/>
+          <w:numId w:val="18"/>
+        </w:numPr>
         <w:tabs>
           <w:tab w:val="center" w:pos="4252"/>
           <w:tab w:val="right" w:pos="8504"/>
         </w:tabs>
+        <w:rPr>
+          <w:rFonts w:ascii="Times New Roman" w:hAnsi="Times New Roman" w:cs="Times New Roman"/>
+          <w:sz w:val="24"/>
+          <w:szCs w:val="24"/>
+          <w:lang w:val="en-BR"/>
+        </w:rPr>
+      </w:pPr>
+      <w:r>
+        <w:rPr>
+          <w:rFonts w:ascii="Times New Roman" w:hAnsi="Times New Roman" w:cs="Times New Roman"/>
+          <w:sz w:val="24"/>
+          <w:szCs w:val="24"/>
+          <w:lang w:val="en-BR"/>
+        </w:rPr>
+        <w:t xml:space="preserve">Os padrões de arquitetura </w:t>
+      </w:r>
+      <w:r>
+        <w:rPr>
+          <w:rFonts w:ascii="Times New Roman" w:hAnsi="Times New Roman" w:cs="Times New Roman"/>
+          <w:sz w:val="24"/>
+          <w:szCs w:val="24"/>
+          <w:lang w:val="en-BR"/>
+        </w:rPr>
+        <w:t>(e.g.</w:t>
+      </w:r>
+      <w:r>
+        <w:rPr>
+          <w:rFonts w:ascii="Times New Roman" w:hAnsi="Times New Roman" w:cs="Times New Roman"/>
+          <w:sz w:val="24"/>
+          <w:szCs w:val="24"/>
+          <w:lang w:val="en-BR"/>
+        </w:rPr>
+        <w:t xml:space="preserve">: </w:t>
+      </w:r>
+      <w:r>
+        <w:rPr>
+          <w:rFonts w:ascii="Times New Roman" w:hAnsi="Times New Roman" w:cs="Times New Roman"/>
+          <w:i/>
+          <w:iCs/>
+          <w:sz w:val="24"/>
+          <w:szCs w:val="24"/>
+          <w:lang w:val="en-BR"/>
+        </w:rPr>
+        <w:t>Clean Architecture</w:t>
+      </w:r>
+      <w:r>
+        <w:rPr>
+          <w:rFonts w:ascii="Times New Roman" w:hAnsi="Times New Roman" w:cs="Times New Roman"/>
+          <w:sz w:val="24"/>
+          <w:szCs w:val="24"/>
+          <w:lang w:val="en-BR"/>
+        </w:rPr>
+        <w:t>) que a IA deve seguir ao sugerir código; e</w:t>
+      </w:r>
+    </w:p>
+    <w:p>
+      <w:pPr>
+        <w:pStyle w:val="ListParagraph"/>
+        <w:numPr>
+          <w:ilvl w:val="0"/>
+          <w:numId w:val="18"/>
+        </w:numPr>
+        <w:tabs>
+          <w:tab w:val="center" w:pos="4252"/>
+          <w:tab w:val="right" w:pos="8504"/>
+        </w:tabs>
+        <w:rPr>
+          <w:rFonts w:ascii="Times New Roman" w:hAnsi="Times New Roman" w:cs="Times New Roman"/>
+          <w:sz w:val="24"/>
+          <w:szCs w:val="24"/>
+          <w:lang w:val="en-BR"/>
+        </w:rPr>
+      </w:pPr>
+      <w:r>
+        <w:rPr>
+          <w:rFonts w:ascii="Times New Roman" w:hAnsi="Times New Roman" w:cs="Times New Roman"/>
+          <w:sz w:val="24"/>
+          <w:szCs w:val="24"/>
+          <w:lang w:val="en-BR"/>
+        </w:rPr>
+        <w:t>Restrições de segurança que impedem a IA de sugerir práticas obsoletas.</w:t>
+      </w:r>
+    </w:p>
+    <w:p>
+      <w:pPr>
+        <w:pStyle w:val="ListParagraph"/>
+        <w:tabs>
+          <w:tab w:val="center" w:pos="4252"/>
+          <w:tab w:val="right" w:pos="8504"/>
+        </w:tabs>
+        <w:ind w:left="1210" w:firstLine="0"/>
+        <w:rPr>
+          <w:rFonts w:ascii="Times New Roman" w:hAnsi="Times New Roman" w:cs="Times New Roman"/>
+          <w:sz w:val="24"/>
+          <w:szCs w:val="24"/>
+          <w:lang w:val="en-BR"/>
+        </w:rPr>
+      </w:pPr>
+    </w:p>
+    <w:p>
+      <w:pPr>
+        <w:tabs>
+          <w:tab w:val="center" w:pos="4252"/>
+          <w:tab w:val="right" w:pos="8504"/>
+        </w:tabs>
         <w:ind w:firstLine="0"/>
         <w:contextualSpacing/>
         <w:rPr>
-          <w:rFonts w:ascii="Times New Roman" w:eastAsia="Times New Roman" w:hAnsi="Times New Roman" w:cs="Times New Roman"/>
-          <w:b/>
-          <w:sz w:val="24"/>
-          <w:szCs w:val="24"/>
-          <w:lang w:val="en-BR" w:eastAsia="pt-BR"/>
-        </w:rPr>
-      </w:pPr>
-    </w:p>
-    <w:p>
-      <w:pPr>
-        <w:ind w:firstLine="0"/>
-        <w:rPr>
-          <w:rFonts w:ascii="Times New Roman" w:eastAsia="Times New Roman" w:hAnsi="Times New Roman" w:cs="Times New Roman"/>
-          <w:b/>
-          <w:sz w:val="24"/>
-          <w:szCs w:val="24"/>
-          <w:lang w:val="pt-PT" w:eastAsia="pt-BR"/>
-        </w:rPr>
-      </w:pPr>
-      <w:r>
-        <w:rPr>
-          <w:rFonts w:ascii="Times New Roman" w:eastAsia="Times New Roman" w:hAnsi="Times New Roman" w:cs="Times New Roman"/>
-          <w:b/>
-          <w:sz w:val="24"/>
-          <w:szCs w:val="24"/>
-          <w:lang w:val="pt-PT" w:eastAsia="pt-BR"/>
-        </w:rPr>
-        <w:t>PERCURSO METODOLÓGICO DA INTERVENÇÃO</w:t>
+          <w:rFonts w:ascii="Times New Roman" w:hAnsi="Times New Roman" w:cs="Times New Roman"/>
+          <w:sz w:val="24"/>
+          <w:szCs w:val="24"/>
+          <w:lang w:val="en-BR"/>
+        </w:rPr>
+      </w:pPr>
+      <w:r>
+        <w:rPr>
+          <w:rFonts w:ascii="Times New Roman" w:hAnsi="Times New Roman" w:cs="Times New Roman"/>
+          <w:sz w:val="24"/>
+          <w:szCs w:val="24"/>
+          <w:lang w:val="en-BR"/>
+        </w:rPr>
+        <w:t xml:space="preserve">Dessa forma, o IDP não apenas facilita o uso da IA, mas atua como um filtro de governança, garantindo que o código gerado esteja em conformidade com as diretrizes corporativas antes mesmo do primeiro </w:t>
+      </w:r>
+      <w:r>
+        <w:rPr>
+          <w:rFonts w:ascii="Times New Roman" w:hAnsi="Times New Roman" w:cs="Times New Roman"/>
+          <w:i/>
+          <w:iCs/>
+          <w:sz w:val="24"/>
+          <w:szCs w:val="24"/>
+          <w:lang w:val="en-BR"/>
+        </w:rPr>
+        <w:t>build</w:t>
+      </w:r>
+      <w:r>
+        <w:rPr>
+          <w:rFonts w:ascii="Times New Roman" w:hAnsi="Times New Roman" w:cs="Times New Roman"/>
+          <w:sz w:val="24"/>
+          <w:szCs w:val="24"/>
+          <w:lang w:val="en-BR"/>
+        </w:rPr>
+        <w:t>.</w:t>
       </w:r>
     </w:p>
     <w:p>
@@ -1518,38 +1800,59 @@
         <w:ind w:firstLine="0"/>
         <w:contextualSpacing/>
         <w:rPr>
-          <w:rFonts w:ascii="Times New Roman" w:eastAsia="Times New Roman" w:hAnsi="Times New Roman" w:cs="Times New Roman"/>
-          <w:b/>
-          <w:sz w:val="24"/>
-          <w:szCs w:val="24"/>
-          <w:lang w:val="pt-PT" w:eastAsia="pt-BR"/>
-        </w:rPr>
-      </w:pPr>
-    </w:p>
-    <w:p>
-      <w:pPr>
+          <w:rFonts w:ascii="Times New Roman" w:hAnsi="Times New Roman" w:cs="Times New Roman"/>
+          <w:sz w:val="24"/>
+          <w:szCs w:val="24"/>
+          <w:lang w:val="en-BR"/>
+        </w:rPr>
+      </w:pPr>
+    </w:p>
+    <w:p>
+      <w:pPr>
+        <w:tabs>
+          <w:tab w:val="center" w:pos="4252"/>
+          <w:tab w:val="right" w:pos="8504"/>
+        </w:tabs>
+        <w:contextualSpacing/>
+        <w:rPr>
+          <w:rFonts w:ascii="Times New Roman" w:hAnsi="Times New Roman" w:cs="Times New Roman"/>
+          <w:b/>
+          <w:bCs/>
+          <w:sz w:val="24"/>
+          <w:szCs w:val="24"/>
+          <w:lang w:val="en-BR"/>
+        </w:rPr>
+      </w:pPr>
+    </w:p>
+    <w:p>
+      <w:pPr>
+        <w:tabs>
+          <w:tab w:val="center" w:pos="4252"/>
+          <w:tab w:val="right" w:pos="8504"/>
+        </w:tabs>
         <w:ind w:firstLine="0"/>
-        <w:rPr>
-          <w:rFonts w:ascii="Times New Roman" w:eastAsia="Times New Roman" w:hAnsi="Times New Roman" w:cs="Times New Roman"/>
-          <w:sz w:val="24"/>
-          <w:szCs w:val="24"/>
-          <w:lang w:val="en-BR"/>
-        </w:rPr>
-      </w:pPr>
-      <w:r>
-        <w:rPr>
-          <w:rFonts w:ascii="Times New Roman" w:eastAsia="Times New Roman" w:hAnsi="Times New Roman" w:cs="Times New Roman"/>
+        <w:contextualSpacing/>
+        <w:rPr>
+          <w:rFonts w:ascii="Times New Roman" w:hAnsi="Times New Roman" w:cs="Times New Roman"/>
+          <w:sz w:val="24"/>
+          <w:szCs w:val="24"/>
+          <w:lang w:val="en-BR"/>
+        </w:rPr>
+      </w:pPr>
+      <w:r>
+        <w:rPr>
+          <w:rFonts w:ascii="Times New Roman" w:hAnsi="Times New Roman" w:cs="Times New Roman"/>
           <w:b/>
           <w:bCs/>
           <w:sz w:val="24"/>
           <w:szCs w:val="24"/>
           <w:lang w:val="en-BR"/>
         </w:rPr>
-        <w:t>Nota Metodológica sobre o uso de Inteligência Artificial</w:t>
-      </w:r>
-      <w:r>
-        <w:rPr>
-          <w:rFonts w:ascii="Times New Roman" w:eastAsia="Times New Roman" w:hAnsi="Times New Roman" w:cs="Times New Roman"/>
+        <w:t>Ciclo DevSecOps e Segurança (Cybersecurity)</w:t>
+      </w:r>
+      <w:r>
+        <w:rPr>
+          <w:rFonts w:ascii="Times New Roman" w:hAnsi="Times New Roman" w:cs="Times New Roman"/>
           <w:sz w:val="24"/>
           <w:szCs w:val="24"/>
           <w:lang w:val="en-BR"/>
@@ -1559,62 +1862,329 @@
     </w:p>
     <w:p>
       <w:pPr>
+        <w:tabs>
+          <w:tab w:val="center" w:pos="4252"/>
+          <w:tab w:val="right" w:pos="8504"/>
+        </w:tabs>
         <w:ind w:firstLine="0"/>
-        <w:rPr>
-          <w:rFonts w:ascii="Times New Roman" w:eastAsia="Times New Roman" w:hAnsi="Times New Roman" w:cs="Times New Roman"/>
-          <w:sz w:val="24"/>
-          <w:szCs w:val="24"/>
-          <w:lang w:val="en-BR"/>
-        </w:rPr>
-      </w:pPr>
-    </w:p>
-    <w:p>
-      <w:pPr>
-        <w:rPr>
-          <w:rFonts w:ascii="Times New Roman" w:eastAsia="Times New Roman" w:hAnsi="Times New Roman" w:cs="Times New Roman"/>
-          <w:sz w:val="24"/>
-          <w:szCs w:val="24"/>
-          <w:lang w:val="en-BR"/>
-        </w:rPr>
-      </w:pPr>
-      <w:r>
-        <w:rPr>
-          <w:rFonts w:ascii="Times New Roman" w:eastAsia="Times New Roman" w:hAnsi="Times New Roman" w:cs="Times New Roman"/>
-          <w:sz w:val="24"/>
-          <w:szCs w:val="24"/>
-          <w:lang w:val="en-BR"/>
-        </w:rPr>
-        <w:t xml:space="preserve">Em conformidade com as diretrizes e boas práticas acadêmicas atuais, declara-se que a elaboração deste projeto contou com o apoio da ferramenta de inteligência artificial generativa Google Gemini. A IA foi utilizada exclusivamente como assistente para estruturação do escopo, </w:t>
-      </w:r>
-      <w:r>
-        <w:rPr>
-          <w:rFonts w:ascii="Times New Roman" w:eastAsia="Times New Roman" w:hAnsi="Times New Roman" w:cs="Times New Roman"/>
+        <w:contextualSpacing/>
+        <w:rPr>
+          <w:rFonts w:ascii="Times New Roman" w:hAnsi="Times New Roman" w:cs="Times New Roman"/>
+          <w:sz w:val="24"/>
+          <w:szCs w:val="24"/>
+          <w:lang w:val="en-BR"/>
+        </w:rPr>
+      </w:pPr>
+    </w:p>
+    <w:p>
+      <w:pPr>
+        <w:tabs>
+          <w:tab w:val="center" w:pos="4252"/>
+          <w:tab w:val="right" w:pos="8504"/>
+        </w:tabs>
+        <w:contextualSpacing/>
+        <w:rPr>
+          <w:rFonts w:ascii="Times New Roman" w:hAnsi="Times New Roman" w:cs="Times New Roman"/>
+          <w:sz w:val="24"/>
+          <w:szCs w:val="24"/>
+          <w:lang w:val="en-BR"/>
+        </w:rPr>
+      </w:pPr>
+      <w:r>
+        <w:rPr>
+          <w:rFonts w:ascii="Times New Roman" w:hAnsi="Times New Roman" w:cs="Times New Roman"/>
+          <w:sz w:val="24"/>
+          <w:szCs w:val="24"/>
+          <w:lang w:val="en-BR"/>
+        </w:rPr>
+        <w:t xml:space="preserve">A adoção do IDP e dos </w:t>
+      </w:r>
+      <w:r>
+        <w:rPr>
+          <w:rFonts w:ascii="Times New Roman" w:hAnsi="Times New Roman" w:cs="Times New Roman"/>
           <w:i/>
           <w:iCs/>
           <w:sz w:val="24"/>
           <w:szCs w:val="24"/>
           <w:lang w:val="en-BR"/>
         </w:rPr>
-        <w:t>brainstorming</w:t>
-      </w:r>
-      <w:r>
-        <w:rPr>
-          <w:rFonts w:ascii="Times New Roman" w:eastAsia="Times New Roman" w:hAnsi="Times New Roman" w:cs="Times New Roman"/>
-          <w:sz w:val="24"/>
-          <w:szCs w:val="24"/>
-          <w:lang w:val="en-BR"/>
-        </w:rPr>
-        <w:t xml:space="preserve"> de soluções arquiteturais e organização textual das ideias. A autoria, as decisões arquiteturais da </w:t>
-      </w:r>
-      <w:r>
-        <w:rPr>
-          <w:rFonts w:ascii="Times New Roman" w:eastAsia="Times New Roman" w:hAnsi="Times New Roman" w:cs="Times New Roman"/>
+        <w:t>Golden Paths</w:t>
+      </w:r>
+      <w:r>
+        <w:rPr>
+          <w:rFonts w:ascii="Times New Roman" w:hAnsi="Times New Roman" w:cs="Times New Roman"/>
+          <w:sz w:val="24"/>
+          <w:szCs w:val="24"/>
+          <w:lang w:val="en-BR"/>
+        </w:rPr>
+        <w:t xml:space="preserve"> é o alicerce para materializar o ciclo DevSecOps. Ao invés de a segurança ser um gargalo no final do desenvolvimento, ela é injetada na origem (</w:t>
+      </w:r>
+      <w:r>
+        <w:rPr>
+          <w:rFonts w:ascii="Times New Roman" w:hAnsi="Times New Roman" w:cs="Times New Roman"/>
           <w:i/>
           <w:iCs/>
           <w:sz w:val="24"/>
           <w:szCs w:val="24"/>
           <w:lang w:val="en-BR"/>
         </w:rPr>
+        <w:t>Shift-Left</w:t>
+      </w:r>
+      <w:r>
+        <w:rPr>
+          <w:rFonts w:ascii="Times New Roman" w:hAnsi="Times New Roman" w:cs="Times New Roman"/>
+          <w:sz w:val="24"/>
+          <w:szCs w:val="24"/>
+          <w:lang w:val="en-BR"/>
+        </w:rPr>
+        <w:t xml:space="preserve">). O uso obrigatório de imagens de contêiner </w:t>
+      </w:r>
+      <w:r>
+        <w:rPr>
+          <w:rFonts w:ascii="Times New Roman" w:hAnsi="Times New Roman" w:cs="Times New Roman"/>
+          <w:i/>
+          <w:iCs/>
+          <w:sz w:val="24"/>
+          <w:szCs w:val="24"/>
+          <w:lang w:val="en-BR"/>
+        </w:rPr>
+        <w:t>distroless</w:t>
+      </w:r>
+      <w:r>
+        <w:rPr>
+          <w:rFonts w:ascii="Times New Roman" w:hAnsi="Times New Roman" w:cs="Times New Roman"/>
+          <w:sz w:val="24"/>
+          <w:szCs w:val="24"/>
+          <w:lang w:val="en-BR"/>
+        </w:rPr>
+        <w:t xml:space="preserve"> da Chainguard é um exemplo prático dessa governança: os projetos já nascem livres de vulnerabilidades conhecidas e sem </w:t>
+      </w:r>
+      <w:r>
+        <w:rPr>
+          <w:rFonts w:ascii="Times New Roman" w:hAnsi="Times New Roman" w:cs="Times New Roman"/>
+          <w:i/>
+          <w:iCs/>
+          <w:sz w:val="24"/>
+          <w:szCs w:val="24"/>
+          <w:lang w:val="en-BR"/>
+        </w:rPr>
+        <w:t>shells</w:t>
+      </w:r>
+      <w:r>
+        <w:rPr>
+          <w:rFonts w:ascii="Times New Roman" w:hAnsi="Times New Roman" w:cs="Times New Roman"/>
+          <w:sz w:val="24"/>
+          <w:szCs w:val="24"/>
+          <w:lang w:val="en-BR"/>
+        </w:rPr>
+        <w:t xml:space="preserve"> (CHAINGUARD, 2026). Complementarmente, o Kyverno atua como motor de </w:t>
+      </w:r>
+      <w:r>
+        <w:rPr>
+          <w:rFonts w:ascii="Times New Roman" w:hAnsi="Times New Roman" w:cs="Times New Roman"/>
+          <w:i/>
+          <w:iCs/>
+          <w:sz w:val="24"/>
+          <w:szCs w:val="24"/>
+          <w:lang w:val="en-BR"/>
+        </w:rPr>
+        <w:t>Policy as Code</w:t>
+      </w:r>
+      <w:r>
+        <w:rPr>
+          <w:rFonts w:ascii="Times New Roman" w:hAnsi="Times New Roman" w:cs="Times New Roman"/>
+          <w:sz w:val="24"/>
+          <w:szCs w:val="24"/>
+          <w:lang w:val="en-BR"/>
+        </w:rPr>
+        <w:t xml:space="preserve">, bloqueando implantações fora do padrão (KYVERNO, 2026), e o </w:t>
+      </w:r>
+      <w:r>
+        <w:rPr>
+          <w:rFonts w:ascii="Times New Roman" w:hAnsi="Times New Roman" w:cs="Times New Roman"/>
+          <w:i/>
+          <w:iCs/>
+          <w:sz w:val="24"/>
+          <w:szCs w:val="24"/>
+          <w:lang w:val="en-BR"/>
+        </w:rPr>
+        <w:t>Azure Key Vault</w:t>
+      </w:r>
+      <w:r>
+        <w:rPr>
+          <w:rFonts w:ascii="Times New Roman" w:hAnsi="Times New Roman" w:cs="Times New Roman"/>
+          <w:sz w:val="24"/>
+          <w:szCs w:val="24"/>
+          <w:lang w:val="en-BR"/>
+        </w:rPr>
+        <w:t xml:space="preserve"> gerencia segredos de forma segura via </w:t>
+      </w:r>
+      <w:r>
+        <w:rPr>
+          <w:rFonts w:ascii="Times New Roman" w:hAnsi="Times New Roman" w:cs="Times New Roman"/>
+          <w:i/>
+          <w:iCs/>
+          <w:sz w:val="24"/>
+          <w:szCs w:val="24"/>
+          <w:lang w:val="en-BR"/>
+        </w:rPr>
+        <w:t>CSI Driver</w:t>
+      </w:r>
+      <w:r>
+        <w:rPr>
+          <w:rFonts w:ascii="Times New Roman" w:hAnsi="Times New Roman" w:cs="Times New Roman"/>
+          <w:sz w:val="24"/>
+          <w:szCs w:val="24"/>
+          <w:lang w:val="en-BR"/>
+        </w:rPr>
+        <w:t xml:space="preserve"> (MICROSOFT, 2026b).</w:t>
+      </w:r>
+    </w:p>
+    <w:p>
+      <w:pPr>
+        <w:tabs>
+          <w:tab w:val="center" w:pos="4252"/>
+          <w:tab w:val="right" w:pos="8504"/>
+        </w:tabs>
+        <w:ind w:firstLine="0"/>
+        <w:contextualSpacing/>
+        <w:rPr>
+          <w:rFonts w:ascii="Times New Roman" w:eastAsia="Times New Roman" w:hAnsi="Times New Roman" w:cs="Times New Roman"/>
+          <w:b/>
+          <w:sz w:val="24"/>
+          <w:szCs w:val="24"/>
+          <w:lang w:val="en-BR" w:eastAsia="pt-BR"/>
+        </w:rPr>
+      </w:pPr>
+    </w:p>
+    <w:p>
+      <w:pPr>
+        <w:ind w:firstLine="0"/>
+        <w:rPr>
+          <w:rFonts w:ascii="Times New Roman" w:eastAsia="Times New Roman" w:hAnsi="Times New Roman" w:cs="Times New Roman"/>
+          <w:b/>
+          <w:sz w:val="24"/>
+          <w:szCs w:val="24"/>
+          <w:lang w:val="pt-PT" w:eastAsia="pt-BR"/>
+        </w:rPr>
+      </w:pPr>
+      <w:r>
+        <w:rPr>
+          <w:rFonts w:ascii="Times New Roman" w:eastAsia="Times New Roman" w:hAnsi="Times New Roman" w:cs="Times New Roman"/>
+          <w:b/>
+          <w:sz w:val="24"/>
+          <w:szCs w:val="24"/>
+          <w:lang w:val="pt-PT" w:eastAsia="pt-BR"/>
+        </w:rPr>
+        <w:t>PERCURSO METODOLÓGICO DA INTERVENÇÃO</w:t>
+      </w:r>
+    </w:p>
+    <w:p>
+      <w:pPr>
+        <w:tabs>
+          <w:tab w:val="center" w:pos="4252"/>
+          <w:tab w:val="right" w:pos="8504"/>
+        </w:tabs>
+        <w:ind w:firstLine="0"/>
+        <w:contextualSpacing/>
+        <w:rPr>
+          <w:rFonts w:ascii="Times New Roman" w:eastAsia="Times New Roman" w:hAnsi="Times New Roman" w:cs="Times New Roman"/>
+          <w:b/>
+          <w:sz w:val="24"/>
+          <w:szCs w:val="24"/>
+          <w:lang w:val="pt-PT" w:eastAsia="pt-BR"/>
+        </w:rPr>
+      </w:pPr>
+    </w:p>
+    <w:p>
+      <w:pPr>
+        <w:ind w:firstLine="0"/>
+        <w:rPr>
+          <w:rFonts w:ascii="Times New Roman" w:eastAsia="Times New Roman" w:hAnsi="Times New Roman" w:cs="Times New Roman"/>
+          <w:sz w:val="24"/>
+          <w:szCs w:val="24"/>
+          <w:lang w:val="en-BR"/>
+        </w:rPr>
+      </w:pPr>
+      <w:r>
+        <w:rPr>
+          <w:rFonts w:ascii="Times New Roman" w:eastAsia="Times New Roman" w:hAnsi="Times New Roman" w:cs="Times New Roman"/>
+          <w:b/>
+          <w:bCs/>
+          <w:sz w:val="24"/>
+          <w:szCs w:val="24"/>
+          <w:lang w:val="en-BR"/>
+        </w:rPr>
+        <w:t>Nota Metodológica sobre o uso de Inteligência Artificial</w:t>
+      </w:r>
+      <w:r>
+        <w:rPr>
+          <w:rFonts w:ascii="Times New Roman" w:eastAsia="Times New Roman" w:hAnsi="Times New Roman" w:cs="Times New Roman"/>
+          <w:sz w:val="24"/>
+          <w:szCs w:val="24"/>
+          <w:lang w:val="en-BR"/>
+        </w:rPr>
+        <w:t xml:space="preserve"> </w:t>
+      </w:r>
+    </w:p>
+    <w:p>
+      <w:pPr>
+        <w:ind w:firstLine="0"/>
+        <w:rPr>
+          <w:rFonts w:ascii="Times New Roman" w:eastAsia="Times New Roman" w:hAnsi="Times New Roman" w:cs="Times New Roman"/>
+          <w:sz w:val="24"/>
+          <w:szCs w:val="24"/>
+          <w:lang w:val="en-BR"/>
+        </w:rPr>
+      </w:pPr>
+    </w:p>
+    <w:p>
+      <w:pPr>
+        <w:rPr>
+          <w:rFonts w:ascii="Times New Roman" w:eastAsia="Times New Roman" w:hAnsi="Times New Roman" w:cs="Times New Roman"/>
+          <w:sz w:val="24"/>
+          <w:szCs w:val="24"/>
+          <w:lang w:val="en-BR"/>
+        </w:rPr>
+      </w:pPr>
+      <w:r>
+        <w:rPr>
+          <w:rFonts w:ascii="Times New Roman" w:eastAsia="Times New Roman" w:hAnsi="Times New Roman" w:cs="Times New Roman"/>
+          <w:sz w:val="24"/>
+          <w:szCs w:val="24"/>
+          <w:lang w:val="en-BR"/>
+        </w:rPr>
+        <w:t xml:space="preserve">Em conformidade com as diretrizes e boas práticas acadêmicas atuais, declara-se que a elaboração deste projeto contou com o apoio da ferramenta de inteligência artificial generativa Google Gemini. A IA foi utilizada exclusivamente como assistente para estruturação do escopo, </w:t>
+      </w:r>
+      <w:r>
+        <w:rPr>
+          <w:rFonts w:ascii="Times New Roman" w:eastAsia="Times New Roman" w:hAnsi="Times New Roman" w:cs="Times New Roman"/>
+          <w:i/>
+          <w:iCs/>
+          <w:sz w:val="24"/>
+          <w:szCs w:val="24"/>
+          <w:lang w:val="en-BR"/>
+        </w:rPr>
+        <w:t>brainstorming</w:t>
+      </w:r>
+      <w:r>
+        <w:rPr>
+          <w:rFonts w:ascii="Times New Roman" w:eastAsia="Times New Roman" w:hAnsi="Times New Roman" w:cs="Times New Roman"/>
+          <w:sz w:val="24"/>
+          <w:szCs w:val="24"/>
+          <w:lang w:val="en-BR"/>
+        </w:rPr>
+        <w:t xml:space="preserve"> de soluções arquiteturais e organização textual das ideias. A autoria, as decisões arquiteturais da </w:t>
+      </w:r>
+      <w:r>
+        <w:rPr>
+          <w:rFonts w:ascii="Times New Roman" w:eastAsia="Times New Roman" w:hAnsi="Times New Roman" w:cs="Times New Roman"/>
+          <w:i/>
+          <w:iCs/>
+          <w:sz w:val="24"/>
+          <w:szCs w:val="24"/>
+          <w:lang w:val="en-BR"/>
+        </w:rPr>
         <w:t>stack</w:t>
       </w:r>
       <w:r>
@@ -1624,7 +2194,122 @@
           <w:szCs w:val="24"/>
           <w:lang w:val="en-BR"/>
         </w:rPr>
-        <w:t xml:space="preserve"> tecnológica (Azure, </w:t>
+        <w:t xml:space="preserve"> tecnológica (Azure, Crossplane, Kyverno), a curadoria do conteúdo e a validação teórica são de inteira responsabilidade do autor deste documento.</w:t>
+      </w:r>
+    </w:p>
+    <w:p>
+      <w:pPr>
+        <w:ind w:firstLine="0"/>
+        <w:rPr>
+          <w:rFonts w:ascii="Times New Roman" w:eastAsia="Times New Roman" w:hAnsi="Times New Roman" w:cs="Times New Roman"/>
+          <w:b/>
+          <w:bCs/>
+          <w:sz w:val="24"/>
+          <w:szCs w:val="24"/>
+          <w:lang w:val="en-BR"/>
+        </w:rPr>
+      </w:pPr>
+    </w:p>
+    <w:p>
+      <w:pPr>
+        <w:ind w:firstLine="0"/>
+        <w:rPr>
+          <w:rFonts w:ascii="Times New Roman" w:eastAsia="Times New Roman" w:hAnsi="Times New Roman" w:cs="Times New Roman"/>
+          <w:sz w:val="24"/>
+          <w:szCs w:val="24"/>
+          <w:lang w:val="en-BR"/>
+        </w:rPr>
+      </w:pPr>
+      <w:bookmarkStart w:id="0" w:name="_Hlk224757501"/>
+      <w:bookmarkStart w:id="1" w:name="_Hlk224757461"/>
+      <w:r>
+        <w:rPr>
+          <w:rFonts w:ascii="Times New Roman" w:eastAsia="Times New Roman" w:hAnsi="Times New Roman" w:cs="Times New Roman"/>
+          <w:b/>
+          <w:bCs/>
+          <w:sz w:val="24"/>
+          <w:szCs w:val="24"/>
+          <w:lang w:val="en-BR"/>
+        </w:rPr>
+        <w:t>Arquitetura Lógica da Solução</w:t>
+      </w:r>
+      <w:bookmarkEnd w:id="0"/>
+      <w:r>
+        <w:rPr>
+          <w:rFonts w:ascii="Times New Roman" w:eastAsia="Times New Roman" w:hAnsi="Times New Roman" w:cs="Times New Roman"/>
+          <w:sz w:val="24"/>
+          <w:szCs w:val="24"/>
+          <w:lang w:val="en-BR"/>
+        </w:rPr>
+        <w:t xml:space="preserve"> </w:t>
+      </w:r>
+    </w:p>
+    <w:p>
+      <w:pPr>
+        <w:ind w:firstLine="0"/>
+        <w:rPr>
+          <w:rFonts w:ascii="Times New Roman" w:eastAsia="Times New Roman" w:hAnsi="Times New Roman" w:cs="Times New Roman"/>
+          <w:sz w:val="24"/>
+          <w:szCs w:val="24"/>
+          <w:lang w:val="en-BR"/>
+        </w:rPr>
+      </w:pPr>
+    </w:p>
+    <w:bookmarkEnd w:id="1"/>
+    <w:p>
+      <w:pPr>
+        <w:rPr>
+          <w:rFonts w:ascii="Times New Roman" w:eastAsia="Times New Roman" w:hAnsi="Times New Roman" w:cs="Times New Roman"/>
+          <w:sz w:val="24"/>
+          <w:szCs w:val="24"/>
+          <w:lang w:val="en-BR"/>
+        </w:rPr>
+      </w:pPr>
+      <w:r>
+        <w:rPr>
+          <w:rFonts w:ascii="Times New Roman" w:eastAsia="Times New Roman" w:hAnsi="Times New Roman" w:cs="Times New Roman"/>
+          <w:sz w:val="24"/>
+          <w:szCs w:val="24"/>
+          <w:lang w:val="en-BR"/>
+        </w:rPr>
+        <w:t>Para garantir que o IDP seja flexível, confiável e resiliente a mudanças, a sua arquitetura lógica foi desenhada seguindo o princípio de forte separação de responsabilidades (SKELTON; PAIS, 2019). O sistema é modular o suficiente para que cada componente tenha um escopo único, garantindo alta coesão e baixo acoplamento.</w:t>
+      </w:r>
+    </w:p>
+    <w:p>
+      <w:pPr>
+        <w:rPr>
+          <w:rFonts w:ascii="Times New Roman" w:eastAsia="Times New Roman" w:hAnsi="Times New Roman" w:cs="Times New Roman"/>
+          <w:sz w:val="24"/>
+          <w:szCs w:val="24"/>
+          <w:lang w:val="en-BR"/>
+        </w:rPr>
+      </w:pPr>
+      <w:r>
+        <w:rPr>
+          <w:rFonts w:ascii="Times New Roman" w:eastAsia="Times New Roman" w:hAnsi="Times New Roman" w:cs="Times New Roman"/>
+          <w:sz w:val="24"/>
+          <w:szCs w:val="24"/>
+          <w:lang w:val="en-BR"/>
+        </w:rPr>
+        <w:t>Conforme ilustrado n</w:t>
+      </w:r>
+      <w:r>
+        <w:rPr>
+          <w:rFonts w:ascii="Times New Roman" w:eastAsia="Times New Roman" w:hAnsi="Times New Roman" w:cs="Times New Roman"/>
+          <w:sz w:val="24"/>
+          <w:szCs w:val="24"/>
+          <w:lang w:val="en-BR"/>
+        </w:rPr>
+        <w:t>a</w:t>
+      </w:r>
+      <w:r>
+        <w:rPr>
+          <w:rFonts w:ascii="Times New Roman" w:eastAsia="Times New Roman" w:hAnsi="Times New Roman" w:cs="Times New Roman"/>
+          <w:sz w:val="24"/>
+          <w:szCs w:val="24"/>
+          <w:lang w:val="en-BR"/>
+        </w:rPr>
+        <w:t xml:space="preserve"> Figura 1, o IDP opera através de um fluxo de automação que abstrai a complexidade operacional da infraestrutura de nuvem, centralizando o </w:t>
       </w:r>
       <w:r>
         <w:rPr>
@@ -1634,122 +2319,7 @@
           <w:lang w:val="en-BR"/>
         </w:rPr>
         <w:lastRenderedPageBreak/>
-        <w:t>Crossplane, Kyverno), a curadoria do conteúdo e a validação teórica são de inteira responsabilidade do autor deste documento.</w:t>
-      </w:r>
-    </w:p>
-    <w:p>
-      <w:pPr>
-        <w:ind w:firstLine="0"/>
-        <w:rPr>
-          <w:rFonts w:ascii="Times New Roman" w:eastAsia="Times New Roman" w:hAnsi="Times New Roman" w:cs="Times New Roman"/>
-          <w:b/>
-          <w:bCs/>
-          <w:sz w:val="24"/>
-          <w:szCs w:val="24"/>
-          <w:lang w:val="en-BR"/>
-        </w:rPr>
-      </w:pPr>
-    </w:p>
-    <w:p>
-      <w:pPr>
-        <w:ind w:firstLine="0"/>
-        <w:rPr>
-          <w:rFonts w:ascii="Times New Roman" w:eastAsia="Times New Roman" w:hAnsi="Times New Roman" w:cs="Times New Roman"/>
-          <w:sz w:val="24"/>
-          <w:szCs w:val="24"/>
-          <w:lang w:val="en-BR"/>
-        </w:rPr>
-      </w:pPr>
-      <w:bookmarkStart w:id="0" w:name="_Hlk224757461"/>
-      <w:bookmarkStart w:id="1" w:name="_Hlk224757501"/>
-      <w:r>
-        <w:rPr>
-          <w:rFonts w:ascii="Times New Roman" w:eastAsia="Times New Roman" w:hAnsi="Times New Roman" w:cs="Times New Roman"/>
-          <w:b/>
-          <w:bCs/>
-          <w:sz w:val="24"/>
-          <w:szCs w:val="24"/>
-          <w:lang w:val="en-BR"/>
-        </w:rPr>
-        <w:t>Arquitetura Lógica da Solução</w:t>
-      </w:r>
-      <w:bookmarkEnd w:id="1"/>
-      <w:r>
-        <w:rPr>
-          <w:rFonts w:ascii="Times New Roman" w:eastAsia="Times New Roman" w:hAnsi="Times New Roman" w:cs="Times New Roman"/>
-          <w:sz w:val="24"/>
-          <w:szCs w:val="24"/>
-          <w:lang w:val="en-BR"/>
-        </w:rPr>
-        <w:t xml:space="preserve"> </w:t>
-      </w:r>
-    </w:p>
-    <w:p>
-      <w:pPr>
-        <w:ind w:firstLine="0"/>
-        <w:rPr>
-          <w:rFonts w:ascii="Times New Roman" w:eastAsia="Times New Roman" w:hAnsi="Times New Roman" w:cs="Times New Roman"/>
-          <w:sz w:val="24"/>
-          <w:szCs w:val="24"/>
-          <w:lang w:val="en-BR"/>
-        </w:rPr>
-      </w:pPr>
-    </w:p>
-    <w:bookmarkEnd w:id="0"/>
-    <w:p>
-      <w:pPr>
-        <w:rPr>
-          <w:rFonts w:ascii="Times New Roman" w:eastAsia="Times New Roman" w:hAnsi="Times New Roman" w:cs="Times New Roman"/>
-          <w:sz w:val="24"/>
-          <w:szCs w:val="24"/>
-          <w:lang w:val="en-BR"/>
-        </w:rPr>
-      </w:pPr>
-      <w:r>
-        <w:rPr>
-          <w:rFonts w:ascii="Times New Roman" w:eastAsia="Times New Roman" w:hAnsi="Times New Roman" w:cs="Times New Roman"/>
-          <w:sz w:val="24"/>
-          <w:szCs w:val="24"/>
-          <w:lang w:val="en-BR"/>
-        </w:rPr>
-        <w:t>Para garantir que o IDP seja flexível, confiável e resiliente a mudanças, a sua arquitetura lógica foi desenhada seguindo o princípio de forte separação de responsabilidades (SKELTON; PAIS, 2019). O sistema é modular o suficiente para que cada componente tenha um escopo único, garantindo alta coesão e baixo acoplamento.</w:t>
-      </w:r>
-    </w:p>
-    <w:p>
-      <w:pPr>
-        <w:rPr>
-          <w:rFonts w:ascii="Times New Roman" w:eastAsia="Times New Roman" w:hAnsi="Times New Roman" w:cs="Times New Roman"/>
-          <w:sz w:val="24"/>
-          <w:szCs w:val="24"/>
-          <w:lang w:val="en-BR"/>
-        </w:rPr>
-      </w:pPr>
-      <w:r>
-        <w:rPr>
-          <w:rFonts w:ascii="Times New Roman" w:eastAsia="Times New Roman" w:hAnsi="Times New Roman" w:cs="Times New Roman"/>
-          <w:sz w:val="24"/>
-          <w:szCs w:val="24"/>
-          <w:lang w:val="en-BR"/>
-        </w:rPr>
-        <w:t>Conforme ilustrado n</w:t>
-      </w:r>
-      <w:r>
-        <w:rPr>
-          <w:rFonts w:ascii="Times New Roman" w:eastAsia="Times New Roman" w:hAnsi="Times New Roman" w:cs="Times New Roman"/>
-          <w:sz w:val="24"/>
-          <w:szCs w:val="24"/>
-          <w:lang w:val="en-BR"/>
-        </w:rPr>
-        <w:t>a</w:t>
-      </w:r>
-      <w:r>
-        <w:rPr>
-          <w:rFonts w:ascii="Times New Roman" w:eastAsia="Times New Roman" w:hAnsi="Times New Roman" w:cs="Times New Roman"/>
-          <w:sz w:val="24"/>
-          <w:szCs w:val="24"/>
-          <w:lang w:val="en-BR"/>
-        </w:rPr>
-        <w:t xml:space="preserve"> Figura 1, o IDP opera através de um fluxo de automação que abstrai a complexidade operacional da infraestrutura de nuvem, centralizando o desenvolvimento no padrão GitOps. O fluxo de criação de recursos é estruturado nas seguintes etapas:</w:t>
+        <w:t>desenvolvimento no padrão GitOps. O fluxo de criação de recursos é estruturado nas seguintes etapas:</w:t>
       </w:r>
     </w:p>
     <w:p>
@@ -2030,17 +2600,7 @@
           <w:szCs w:val="24"/>
           <w:lang w:val="en-BR"/>
         </w:rPr>
-        <w:t xml:space="preserve"> automático do código-fonte da aplicação </w:t>
-      </w:r>
-      <w:r>
-        <w:rPr>
-          <w:rFonts w:ascii="Times New Roman" w:eastAsia="Times New Roman" w:hAnsi="Times New Roman" w:cs="Times New Roman"/>
-          <w:sz w:val="24"/>
-          <w:szCs w:val="24"/>
-          <w:lang w:val="en-BR"/>
-        </w:rPr>
-        <w:lastRenderedPageBreak/>
-        <w:t xml:space="preserve">e dos manifestos de infraestrutura para o </w:t>
+        <w:t xml:space="preserve"> automático do código-fonte da aplicação e dos manifestos de infraestrutura para o </w:t>
       </w:r>
       <w:r>
         <w:rPr>
@@ -2229,6 +2789,7 @@
           <w:szCs w:val="24"/>
           <w:lang w:val="en-BR"/>
         </w:rPr>
+        <w:lastRenderedPageBreak/>
         <w:t xml:space="preserve">Implantação da </w:t>
       </w:r>
       <w:r>
@@ -2372,6 +2933,739 @@
     </w:p>
     <w:p>
       <w:pPr>
+        <w:ind w:firstLine="0"/>
+        <w:rPr>
+          <w:rFonts w:ascii="Times New Roman" w:eastAsia="Times New Roman" w:hAnsi="Times New Roman" w:cs="Times New Roman"/>
+          <w:sz w:val="24"/>
+          <w:szCs w:val="24"/>
+          <w:lang w:val="en-BR"/>
+        </w:rPr>
+      </w:pPr>
+    </w:p>
+    <w:p>
+      <w:pPr>
+        <w:tabs>
+          <w:tab w:val="center" w:pos="4252"/>
+          <w:tab w:val="right" w:pos="8504"/>
+        </w:tabs>
+        <w:ind w:firstLine="0"/>
+        <w:contextualSpacing/>
+        <w:rPr>
+          <w:rFonts w:ascii="Times New Roman" w:hAnsi="Times New Roman" w:cs="Times New Roman"/>
+          <w:b/>
+          <w:bCs/>
+          <w:sz w:val="24"/>
+          <w:szCs w:val="24"/>
+          <w:lang w:val="en-BR"/>
+        </w:rPr>
+      </w:pPr>
+      <w:r>
+        <w:rPr>
+          <w:rFonts w:ascii="Times New Roman" w:hAnsi="Times New Roman" w:cs="Times New Roman"/>
+          <w:b/>
+          <w:bCs/>
+          <w:sz w:val="24"/>
+          <w:szCs w:val="24"/>
+          <w:lang w:val="en-BR"/>
+        </w:rPr>
+        <w:t>Fases de Implementação e Estratégia de Implantação</w:t>
+      </w:r>
+    </w:p>
+    <w:p>
+      <w:pPr>
+        <w:tabs>
+          <w:tab w:val="center" w:pos="4252"/>
+          <w:tab w:val="right" w:pos="8504"/>
+        </w:tabs>
+        <w:ind w:firstLine="0"/>
+        <w:contextualSpacing/>
+        <w:rPr>
+          <w:rFonts w:ascii="Times New Roman" w:hAnsi="Times New Roman" w:cs="Times New Roman"/>
+          <w:b/>
+          <w:bCs/>
+          <w:sz w:val="24"/>
+          <w:szCs w:val="24"/>
+          <w:lang w:val="en-BR"/>
+        </w:rPr>
+      </w:pPr>
+    </w:p>
+    <w:p>
+      <w:pPr>
+        <w:tabs>
+          <w:tab w:val="center" w:pos="4252"/>
+          <w:tab w:val="right" w:pos="8504"/>
+        </w:tabs>
+        <w:ind w:firstLine="0"/>
+        <w:contextualSpacing/>
+        <w:rPr>
+          <w:rFonts w:ascii="Times New Roman" w:hAnsi="Times New Roman" w:cs="Times New Roman"/>
+          <w:sz w:val="24"/>
+          <w:szCs w:val="24"/>
+          <w:lang w:val="en-BR"/>
+        </w:rPr>
+      </w:pPr>
+      <w:r>
+        <w:rPr>
+          <w:rFonts w:ascii="Times New Roman" w:hAnsi="Times New Roman" w:cs="Times New Roman"/>
+          <w:sz w:val="24"/>
+          <w:szCs w:val="24"/>
+          <w:lang w:val="en-BR"/>
+        </w:rPr>
+        <w:t xml:space="preserve">Para garantir a viabilidade e a aceitação do IDP na organização, a estratégia de implantação seguirá um modelo incremental dividido em </w:t>
+      </w:r>
+      <w:r>
+        <w:rPr>
+          <w:rFonts w:ascii="Times New Roman" w:hAnsi="Times New Roman" w:cs="Times New Roman"/>
+          <w:sz w:val="24"/>
+          <w:szCs w:val="24"/>
+          <w:lang w:val="en-BR"/>
+        </w:rPr>
+        <w:t xml:space="preserve">grandes </w:t>
+      </w:r>
+      <w:r>
+        <w:rPr>
+          <w:rFonts w:ascii="Times New Roman" w:hAnsi="Times New Roman" w:cs="Times New Roman"/>
+          <w:sz w:val="24"/>
+          <w:szCs w:val="24"/>
+          <w:lang w:val="en-BR"/>
+        </w:rPr>
+        <w:t>fases</w:t>
+      </w:r>
+      <w:r>
+        <w:rPr>
+          <w:rFonts w:ascii="Times New Roman" w:hAnsi="Times New Roman" w:cs="Times New Roman"/>
+          <w:sz w:val="24"/>
+          <w:szCs w:val="24"/>
+          <w:lang w:val="en-BR"/>
+        </w:rPr>
+        <w:t xml:space="preserve"> (</w:t>
+      </w:r>
+      <w:r>
+        <w:rPr>
+          <w:rFonts w:ascii="Times New Roman" w:hAnsi="Times New Roman" w:cs="Times New Roman"/>
+          <w:i/>
+          <w:iCs/>
+          <w:sz w:val="24"/>
+          <w:szCs w:val="24"/>
+          <w:lang w:val="en-BR"/>
+        </w:rPr>
+        <w:t>Milestones</w:t>
+      </w:r>
+      <w:r>
+        <w:rPr>
+          <w:rFonts w:ascii="Times New Roman" w:hAnsi="Times New Roman" w:cs="Times New Roman"/>
+          <w:sz w:val="24"/>
+          <w:szCs w:val="24"/>
+          <w:lang w:val="en-BR"/>
+        </w:rPr>
+        <w:t>)</w:t>
+      </w:r>
+      <w:r>
+        <w:rPr>
+          <w:rFonts w:ascii="Times New Roman" w:hAnsi="Times New Roman" w:cs="Times New Roman"/>
+          <w:sz w:val="24"/>
+          <w:szCs w:val="24"/>
+          <w:lang w:val="en-BR"/>
+        </w:rPr>
+        <w:t>:</w:t>
+      </w:r>
+    </w:p>
+    <w:p>
+      <w:pPr>
+        <w:tabs>
+          <w:tab w:val="center" w:pos="4252"/>
+          <w:tab w:val="right" w:pos="8504"/>
+        </w:tabs>
+        <w:ind w:firstLine="0"/>
+        <w:contextualSpacing/>
+        <w:rPr>
+          <w:rFonts w:ascii="Times New Roman" w:hAnsi="Times New Roman" w:cs="Times New Roman"/>
+          <w:sz w:val="24"/>
+          <w:szCs w:val="24"/>
+          <w:lang w:val="en-BR"/>
+        </w:rPr>
+      </w:pPr>
+    </w:p>
+    <w:p>
+      <w:pPr>
+        <w:numPr>
+          <w:ilvl w:val="0"/>
+          <w:numId w:val="17"/>
+        </w:numPr>
+        <w:tabs>
+          <w:tab w:val="center" w:pos="4252"/>
+          <w:tab w:val="right" w:pos="8504"/>
+        </w:tabs>
+        <w:contextualSpacing/>
+        <w:rPr>
+          <w:rFonts w:ascii="Times New Roman" w:hAnsi="Times New Roman" w:cs="Times New Roman"/>
+          <w:sz w:val="24"/>
+          <w:szCs w:val="24"/>
+          <w:lang w:val="en-BR"/>
+        </w:rPr>
+      </w:pPr>
+      <w:r>
+        <w:rPr>
+          <w:rFonts w:ascii="Times New Roman" w:hAnsi="Times New Roman" w:cs="Times New Roman"/>
+          <w:b/>
+          <w:bCs/>
+          <w:sz w:val="24"/>
+          <w:szCs w:val="24"/>
+          <w:lang w:val="en-BR"/>
+        </w:rPr>
+        <w:t>Fase Piloto (</w:t>
+      </w:r>
+      <w:r>
+        <w:rPr>
+          <w:rFonts w:ascii="Times New Roman" w:hAnsi="Times New Roman" w:cs="Times New Roman"/>
+          <w:b/>
+          <w:bCs/>
+          <w:i/>
+          <w:iCs/>
+          <w:sz w:val="24"/>
+          <w:szCs w:val="24"/>
+          <w:lang w:val="en-BR"/>
+        </w:rPr>
+        <w:t>MVP</w:t>
+      </w:r>
+      <w:r>
+        <w:rPr>
+          <w:rFonts w:ascii="Times New Roman" w:hAnsi="Times New Roman" w:cs="Times New Roman"/>
+          <w:b/>
+          <w:bCs/>
+          <w:sz w:val="24"/>
+          <w:szCs w:val="24"/>
+          <w:lang w:val="en-BR"/>
+        </w:rPr>
+        <w:t>):</w:t>
+      </w:r>
+      <w:r>
+        <w:rPr>
+          <w:rFonts w:ascii="Times New Roman" w:hAnsi="Times New Roman" w:cs="Times New Roman"/>
+          <w:sz w:val="24"/>
+          <w:szCs w:val="24"/>
+          <w:lang w:val="en-BR"/>
+        </w:rPr>
+        <w:t xml:space="preserve"> O projeto iniciará com o desenvolvimento de um Produto Mínimo Viável (</w:t>
+      </w:r>
+      <w:r>
+        <w:rPr>
+          <w:rFonts w:ascii="Times New Roman" w:hAnsi="Times New Roman" w:cs="Times New Roman"/>
+          <w:i/>
+          <w:iCs/>
+          <w:sz w:val="24"/>
+          <w:szCs w:val="24"/>
+          <w:lang w:val="en-BR"/>
+        </w:rPr>
+        <w:t>MVP</w:t>
+      </w:r>
+      <w:r>
+        <w:rPr>
+          <w:rFonts w:ascii="Times New Roman" w:hAnsi="Times New Roman" w:cs="Times New Roman"/>
+          <w:sz w:val="24"/>
+          <w:szCs w:val="24"/>
+          <w:lang w:val="en-BR"/>
+        </w:rPr>
+        <w:t xml:space="preserve">) em um ciclo curto de dois meses. O foco será validar as funcionalidades essenciais de provisionamento e catálogo com um grupo reduzido de desenvolvedores. Este </w:t>
+      </w:r>
+      <w:r>
+        <w:rPr>
+          <w:rFonts w:ascii="Times New Roman" w:hAnsi="Times New Roman" w:cs="Times New Roman"/>
+          <w:i/>
+          <w:iCs/>
+          <w:sz w:val="24"/>
+          <w:szCs w:val="24"/>
+          <w:lang w:val="en-BR"/>
+        </w:rPr>
+        <w:t>MVP</w:t>
+      </w:r>
+      <w:r>
+        <w:rPr>
+          <w:rFonts w:ascii="Times New Roman" w:hAnsi="Times New Roman" w:cs="Times New Roman"/>
+          <w:sz w:val="24"/>
+          <w:szCs w:val="24"/>
+          <w:lang w:val="en-BR"/>
+        </w:rPr>
+        <w:t xml:space="preserve"> será apresentado para gerentes, times e lideranças técnicas (</w:t>
+      </w:r>
+      <w:r>
+        <w:rPr>
+          <w:rFonts w:ascii="Times New Roman" w:hAnsi="Times New Roman" w:cs="Times New Roman"/>
+          <w:i/>
+          <w:iCs/>
+          <w:sz w:val="24"/>
+          <w:szCs w:val="24"/>
+          <w:lang w:val="en-BR"/>
+        </w:rPr>
+        <w:t>Heads</w:t>
+      </w:r>
+      <w:r>
+        <w:rPr>
+          <w:rFonts w:ascii="Times New Roman" w:hAnsi="Times New Roman" w:cs="Times New Roman"/>
+          <w:sz w:val="24"/>
+          <w:szCs w:val="24"/>
+          <w:lang w:val="en-BR"/>
+        </w:rPr>
+        <w:t>) para demonstração de valor e obtenção de aprovação para escala.</w:t>
+      </w:r>
+    </w:p>
+    <w:p>
+      <w:pPr>
+        <w:numPr>
+          <w:ilvl w:val="0"/>
+          <w:numId w:val="17"/>
+        </w:numPr>
+        <w:tabs>
+          <w:tab w:val="center" w:pos="4252"/>
+          <w:tab w:val="right" w:pos="8504"/>
+        </w:tabs>
+        <w:contextualSpacing/>
+        <w:rPr>
+          <w:rFonts w:ascii="Times New Roman" w:hAnsi="Times New Roman" w:cs="Times New Roman"/>
+          <w:sz w:val="24"/>
+          <w:szCs w:val="24"/>
+          <w:lang w:val="en-BR"/>
+        </w:rPr>
+      </w:pPr>
+      <w:r>
+        <w:rPr>
+          <w:rFonts w:ascii="Times New Roman" w:hAnsi="Times New Roman" w:cs="Times New Roman"/>
+          <w:b/>
+          <w:bCs/>
+          <w:i/>
+          <w:iCs/>
+          <w:sz w:val="24"/>
+          <w:szCs w:val="24"/>
+          <w:lang w:val="en-BR"/>
+        </w:rPr>
+        <w:t>Milestone</w:t>
+      </w:r>
+      <w:r>
+        <w:rPr>
+          <w:rFonts w:ascii="Times New Roman" w:hAnsi="Times New Roman" w:cs="Times New Roman"/>
+          <w:b/>
+          <w:bCs/>
+          <w:sz w:val="24"/>
+          <w:szCs w:val="24"/>
+          <w:lang w:val="en-BR"/>
+        </w:rPr>
+        <w:t xml:space="preserve"> 1 - Consolidação do Catálogo (Onboarding):</w:t>
+      </w:r>
+      <w:r>
+        <w:rPr>
+          <w:rFonts w:ascii="Times New Roman" w:hAnsi="Times New Roman" w:cs="Times New Roman"/>
+          <w:sz w:val="24"/>
+          <w:szCs w:val="24"/>
+          <w:lang w:val="en-BR"/>
+        </w:rPr>
+        <w:t xml:space="preserve"> Com o projeto aprovado, o primeiro grande marco será o povoamento do </w:t>
+      </w:r>
+      <w:r>
+        <w:rPr>
+          <w:rFonts w:ascii="Times New Roman" w:hAnsi="Times New Roman" w:cs="Times New Roman"/>
+          <w:i/>
+          <w:iCs/>
+          <w:sz w:val="24"/>
+          <w:szCs w:val="24"/>
+          <w:lang w:val="en-BR"/>
+        </w:rPr>
+        <w:t>Software Catalog</w:t>
+      </w:r>
+      <w:r>
+        <w:rPr>
+          <w:rFonts w:ascii="Times New Roman" w:hAnsi="Times New Roman" w:cs="Times New Roman"/>
+          <w:sz w:val="24"/>
+          <w:szCs w:val="24"/>
+          <w:lang w:val="en-BR"/>
+        </w:rPr>
+        <w:t xml:space="preserve">. Nesta fase, será realizado o </w:t>
+      </w:r>
+      <w:r>
+        <w:rPr>
+          <w:rFonts w:ascii="Times New Roman" w:hAnsi="Times New Roman" w:cs="Times New Roman"/>
+          <w:i/>
+          <w:iCs/>
+          <w:sz w:val="24"/>
+          <w:szCs w:val="24"/>
+          <w:lang w:val="en-BR"/>
+        </w:rPr>
+        <w:t>onboarding</w:t>
+      </w:r>
+      <w:r>
+        <w:rPr>
+          <w:rFonts w:ascii="Times New Roman" w:hAnsi="Times New Roman" w:cs="Times New Roman"/>
+          <w:sz w:val="24"/>
+          <w:szCs w:val="24"/>
+          <w:lang w:val="en-BR"/>
+        </w:rPr>
+        <w:t xml:space="preserve"> de produtos, APIs e softwares legados e atuais. A plataforma disponibilizará interfaces via linha de comando (</w:t>
+      </w:r>
+      <w:r>
+        <w:rPr>
+          <w:rFonts w:ascii="Times New Roman" w:hAnsi="Times New Roman" w:cs="Times New Roman"/>
+          <w:i/>
+          <w:iCs/>
+          <w:sz w:val="24"/>
+          <w:szCs w:val="24"/>
+          <w:lang w:val="en-BR"/>
+        </w:rPr>
+        <w:t>CLI</w:t>
+      </w:r>
+      <w:r>
+        <w:rPr>
+          <w:rFonts w:ascii="Times New Roman" w:hAnsi="Times New Roman" w:cs="Times New Roman"/>
+          <w:sz w:val="24"/>
+          <w:szCs w:val="24"/>
+          <w:lang w:val="en-BR"/>
+        </w:rPr>
+        <w:t>) e interface gráfica (</w:t>
+      </w:r>
+      <w:r>
+        <w:rPr>
+          <w:rFonts w:ascii="Times New Roman" w:hAnsi="Times New Roman" w:cs="Times New Roman"/>
+          <w:i/>
+          <w:iCs/>
+          <w:sz w:val="24"/>
+          <w:szCs w:val="24"/>
+          <w:lang w:val="en-BR"/>
+        </w:rPr>
+        <w:t>UI</w:t>
+      </w:r>
+      <w:r>
+        <w:rPr>
+          <w:rFonts w:ascii="Times New Roman" w:hAnsi="Times New Roman" w:cs="Times New Roman"/>
+          <w:sz w:val="24"/>
+          <w:szCs w:val="24"/>
+          <w:lang w:val="en-BR"/>
+        </w:rPr>
+        <w:t>) para que os responsáveis registrem seus ativos, permitindo que a plataforma ajude na manutenção e operação centralizada no Backstage.</w:t>
+      </w:r>
+    </w:p>
+    <w:p>
+      <w:pPr>
+        <w:numPr>
+          <w:ilvl w:val="0"/>
+          <w:numId w:val="17"/>
+        </w:numPr>
+        <w:tabs>
+          <w:tab w:val="center" w:pos="4252"/>
+          <w:tab w:val="right" w:pos="8504"/>
+        </w:tabs>
+        <w:contextualSpacing/>
+        <w:rPr>
+          <w:rFonts w:ascii="Times New Roman" w:hAnsi="Times New Roman" w:cs="Times New Roman"/>
+          <w:sz w:val="24"/>
+          <w:szCs w:val="24"/>
+          <w:lang w:val="en-BR"/>
+        </w:rPr>
+      </w:pPr>
+      <w:r>
+        <w:rPr>
+          <w:rFonts w:ascii="Times New Roman" w:hAnsi="Times New Roman" w:cs="Times New Roman"/>
+          <w:b/>
+          <w:bCs/>
+          <w:i/>
+          <w:iCs/>
+          <w:sz w:val="24"/>
+          <w:szCs w:val="24"/>
+          <w:lang w:val="en-BR"/>
+        </w:rPr>
+        <w:t>Milestone</w:t>
+      </w:r>
+      <w:r>
+        <w:rPr>
+          <w:rFonts w:ascii="Times New Roman" w:hAnsi="Times New Roman" w:cs="Times New Roman"/>
+          <w:b/>
+          <w:bCs/>
+          <w:sz w:val="24"/>
+          <w:szCs w:val="24"/>
+          <w:lang w:val="en-BR"/>
+        </w:rPr>
+        <w:t xml:space="preserve"> 2 - Desenvolvimento de Templates Estratégicos:</w:t>
+      </w:r>
+      <w:r>
+        <w:rPr>
+          <w:rFonts w:ascii="Times New Roman" w:hAnsi="Times New Roman" w:cs="Times New Roman"/>
+          <w:sz w:val="24"/>
+          <w:szCs w:val="24"/>
+          <w:lang w:val="en-BR"/>
+        </w:rPr>
+        <w:t xml:space="preserve"> O segundo marco consistirá em rodadas de alinhamento com os </w:t>
+      </w:r>
+      <w:r>
+        <w:rPr>
+          <w:rFonts w:ascii="Times New Roman" w:hAnsi="Times New Roman" w:cs="Times New Roman"/>
+          <w:i/>
+          <w:iCs/>
+          <w:sz w:val="24"/>
+          <w:szCs w:val="24"/>
+          <w:lang w:val="en-BR"/>
+        </w:rPr>
+        <w:t>Product Owners</w:t>
+      </w:r>
+      <w:r>
+        <w:rPr>
+          <w:rFonts w:ascii="Times New Roman" w:hAnsi="Times New Roman" w:cs="Times New Roman"/>
+          <w:sz w:val="24"/>
+          <w:szCs w:val="24"/>
+          <w:lang w:val="en-BR"/>
+        </w:rPr>
+        <w:t xml:space="preserve"> (POs) para identificar as demandas reais dos times. O objetivo é desenvolver novos </w:t>
+      </w:r>
+      <w:r>
+        <w:rPr>
+          <w:rFonts w:ascii="Times New Roman" w:hAnsi="Times New Roman" w:cs="Times New Roman"/>
+          <w:i/>
+          <w:iCs/>
+          <w:sz w:val="24"/>
+          <w:szCs w:val="24"/>
+          <w:lang w:val="en-BR"/>
+        </w:rPr>
+        <w:t>templates</w:t>
+      </w:r>
+      <w:r>
+        <w:rPr>
+          <w:rFonts w:ascii="Times New Roman" w:hAnsi="Times New Roman" w:cs="Times New Roman"/>
+          <w:sz w:val="24"/>
+          <w:szCs w:val="24"/>
+          <w:lang w:val="en-BR"/>
+        </w:rPr>
+        <w:t xml:space="preserve"> de </w:t>
+      </w:r>
+      <w:r>
+        <w:rPr>
+          <w:rFonts w:ascii="Times New Roman" w:hAnsi="Times New Roman" w:cs="Times New Roman"/>
+          <w:i/>
+          <w:iCs/>
+          <w:sz w:val="24"/>
+          <w:szCs w:val="24"/>
+          <w:lang w:val="en-BR"/>
+        </w:rPr>
+        <w:t>Golden Paths</w:t>
+      </w:r>
+      <w:r>
+        <w:rPr>
+          <w:rFonts w:ascii="Times New Roman" w:hAnsi="Times New Roman" w:cs="Times New Roman"/>
+          <w:sz w:val="24"/>
+          <w:szCs w:val="24"/>
+          <w:lang w:val="en-BR"/>
+        </w:rPr>
+        <w:t xml:space="preserve"> que estejam alinhados com as necessidades de negócio e requisitos técnicos da organização.</w:t>
+      </w:r>
+    </w:p>
+    <w:p>
+      <w:pPr>
+        <w:numPr>
+          <w:ilvl w:val="0"/>
+          <w:numId w:val="17"/>
+        </w:numPr>
+        <w:tabs>
+          <w:tab w:val="center" w:pos="4252"/>
+          <w:tab w:val="right" w:pos="8504"/>
+        </w:tabs>
+        <w:contextualSpacing/>
+        <w:rPr>
+          <w:rFonts w:ascii="Times New Roman" w:hAnsi="Times New Roman" w:cs="Times New Roman"/>
+          <w:sz w:val="24"/>
+          <w:szCs w:val="24"/>
+          <w:lang w:val="en-BR"/>
+        </w:rPr>
+      </w:pPr>
+      <w:r>
+        <w:rPr>
+          <w:rFonts w:ascii="Times New Roman" w:hAnsi="Times New Roman" w:cs="Times New Roman"/>
+          <w:b/>
+          <w:bCs/>
+          <w:i/>
+          <w:iCs/>
+          <w:sz w:val="24"/>
+          <w:szCs w:val="24"/>
+          <w:lang w:val="en-BR"/>
+        </w:rPr>
+        <w:t>Milestone</w:t>
+      </w:r>
+      <w:r>
+        <w:rPr>
+          <w:rFonts w:ascii="Times New Roman" w:hAnsi="Times New Roman" w:cs="Times New Roman"/>
+          <w:b/>
+          <w:bCs/>
+          <w:sz w:val="24"/>
+          <w:szCs w:val="24"/>
+          <w:lang w:val="en-BR"/>
+        </w:rPr>
+        <w:t xml:space="preserve"> 3 - Padronização Global e Governança:</w:t>
+      </w:r>
+      <w:r>
+        <w:rPr>
+          <w:rFonts w:ascii="Times New Roman" w:hAnsi="Times New Roman" w:cs="Times New Roman"/>
+          <w:sz w:val="24"/>
+          <w:szCs w:val="24"/>
+          <w:lang w:val="en-BR"/>
+        </w:rPr>
+        <w:t xml:space="preserve"> O marco final focará na padronização rigorosa de todos os projetos sob a gestão do IDP. Isso inclui a obrigatoriedade de esteiras de CI/CD padronizadas, a aplicação de </w:t>
+      </w:r>
+      <w:r>
+        <w:rPr>
+          <w:rFonts w:ascii="Times New Roman" w:hAnsi="Times New Roman" w:cs="Times New Roman"/>
+          <w:i/>
+          <w:iCs/>
+          <w:sz w:val="24"/>
+          <w:szCs w:val="24"/>
+          <w:lang w:val="en-BR"/>
+        </w:rPr>
+        <w:t>guardrails</w:t>
+      </w:r>
+      <w:r>
+        <w:rPr>
+          <w:rFonts w:ascii="Times New Roman" w:hAnsi="Times New Roman" w:cs="Times New Roman"/>
+          <w:sz w:val="24"/>
+          <w:szCs w:val="24"/>
+          <w:lang w:val="en-BR"/>
+        </w:rPr>
+        <w:t xml:space="preserve"> de segurança automáticos</w:t>
+      </w:r>
+      <w:r>
+        <w:rPr>
+          <w:rFonts w:ascii="Times New Roman" w:hAnsi="Times New Roman" w:cs="Times New Roman"/>
+          <w:sz w:val="24"/>
+          <w:szCs w:val="24"/>
+          <w:lang w:val="en-BR"/>
+        </w:rPr>
+        <w:t xml:space="preserve"> </w:t>
+      </w:r>
+      <w:r>
+        <w:rPr>
+          <w:rFonts w:ascii="Times New Roman" w:hAnsi="Times New Roman" w:cs="Times New Roman"/>
+          <w:sz w:val="24"/>
+          <w:szCs w:val="24"/>
+          <w:lang w:val="en-BR"/>
+        </w:rPr>
+        <w:t xml:space="preserve">e a garantia de que as aplicações operem sem </w:t>
+      </w:r>
+      <w:r>
+        <w:rPr>
+          <w:rFonts w:ascii="Times New Roman" w:hAnsi="Times New Roman" w:cs="Times New Roman"/>
+          <w:sz w:val="24"/>
+          <w:szCs w:val="24"/>
+          <w:lang w:val="en-BR"/>
+        </w:rPr>
+        <w:lastRenderedPageBreak/>
+        <w:t>vulnerabilidades conhecidas (CVEs), consolidando a cultura DevSecOps na empresa.</w:t>
+      </w:r>
+      <w:r>
+        <w:rPr>
+          <w:rFonts w:ascii="Times New Roman" w:hAnsi="Times New Roman" w:cs="Times New Roman"/>
+          <w:sz w:val="24"/>
+          <w:szCs w:val="24"/>
+          <w:lang w:val="en-BR"/>
+        </w:rPr>
+        <w:t xml:space="preserve"> As ferramentas que irão garantir este</w:t>
+      </w:r>
+      <w:r>
+        <w:rPr>
+          <w:rFonts w:ascii="Times New Roman" w:hAnsi="Times New Roman" w:cs="Times New Roman"/>
+          <w:sz w:val="24"/>
+          <w:szCs w:val="24"/>
+          <w:lang w:val="en-BR"/>
+        </w:rPr>
+        <w:t>s</w:t>
+      </w:r>
+      <w:r>
+        <w:rPr>
+          <w:rFonts w:ascii="Times New Roman" w:hAnsi="Times New Roman" w:cs="Times New Roman"/>
+          <w:sz w:val="24"/>
+          <w:szCs w:val="24"/>
+          <w:lang w:val="en-BR"/>
+        </w:rPr>
+        <w:t xml:space="preserve"> </w:t>
+      </w:r>
+      <w:r>
+        <w:rPr>
+          <w:rFonts w:ascii="Times New Roman" w:hAnsi="Times New Roman" w:cs="Times New Roman"/>
+          <w:i/>
+          <w:iCs/>
+          <w:sz w:val="24"/>
+          <w:szCs w:val="24"/>
+          <w:lang w:val="en-BR"/>
+        </w:rPr>
+        <w:t>guardrail</w:t>
+      </w:r>
+      <w:r>
+        <w:rPr>
+          <w:rFonts w:ascii="Times New Roman" w:hAnsi="Times New Roman" w:cs="Times New Roman"/>
+          <w:i/>
+          <w:iCs/>
+          <w:sz w:val="24"/>
+          <w:szCs w:val="24"/>
+          <w:lang w:val="en-BR"/>
+        </w:rPr>
+        <w:t>s</w:t>
+      </w:r>
+      <w:r>
+        <w:rPr>
+          <w:rFonts w:ascii="Times New Roman" w:hAnsi="Times New Roman" w:cs="Times New Roman"/>
+          <w:sz w:val="24"/>
+          <w:szCs w:val="24"/>
+          <w:lang w:val="en-BR"/>
+        </w:rPr>
+        <w:t xml:space="preserve"> </w:t>
+      </w:r>
+      <w:r>
+        <w:rPr>
+          <w:rFonts w:ascii="Times New Roman" w:hAnsi="Times New Roman" w:cs="Times New Roman"/>
+          <w:sz w:val="24"/>
+          <w:szCs w:val="24"/>
+          <w:lang w:val="en-BR"/>
+        </w:rPr>
+        <w:t>são</w:t>
+      </w:r>
+      <w:r>
+        <w:rPr>
+          <w:rFonts w:ascii="Times New Roman" w:hAnsi="Times New Roman" w:cs="Times New Roman"/>
+          <w:sz w:val="24"/>
+          <w:szCs w:val="24"/>
+          <w:lang w:val="en-BR"/>
+        </w:rPr>
+        <w:t xml:space="preserve"> o SonarQube para garantir qualidade de c</w:t>
+      </w:r>
+      <w:r>
+        <w:rPr>
+          <w:rFonts w:ascii="Times New Roman" w:hAnsi="Times New Roman" w:cs="Times New Roman"/>
+          <w:sz w:val="24"/>
+          <w:szCs w:val="24"/>
+        </w:rPr>
+        <w:t>ódigo e segurança e Trivy</w:t>
+      </w:r>
+      <w:r>
+        <w:rPr>
+          <w:rFonts w:ascii="Times New Roman" w:hAnsi="Times New Roman" w:cs="Times New Roman"/>
+          <w:sz w:val="24"/>
+          <w:szCs w:val="24"/>
+          <w:lang w:val="en-BR"/>
+        </w:rPr>
+        <w:t xml:space="preserve"> para sondar vulnerabilidades e má-configurações.</w:t>
+      </w:r>
+    </w:p>
+    <w:p>
+      <w:pPr>
+        <w:tabs>
+          <w:tab w:val="center" w:pos="4252"/>
+          <w:tab w:val="right" w:pos="8504"/>
+        </w:tabs>
+        <w:ind w:firstLine="0"/>
+        <w:contextualSpacing/>
+        <w:rPr>
+          <w:rFonts w:ascii="Times New Roman" w:hAnsi="Times New Roman" w:cs="Times New Roman"/>
+          <w:b/>
+          <w:bCs/>
+          <w:sz w:val="24"/>
+          <w:szCs w:val="24"/>
+          <w:lang w:val="en-BR"/>
+        </w:rPr>
+      </w:pPr>
+    </w:p>
+    <w:p>
+      <w:pPr>
         <w:tabs>
           <w:tab w:val="center" w:pos="4252"/>
           <w:tab w:val="right" w:pos="8504"/>
@@ -2582,20 +3876,7 @@
           <w:szCs w:val="24"/>
           <w:lang w:val="en-BR" w:eastAsia="pt-BR"/>
         </w:rPr>
-        <w:t xml:space="preserve">Policy as </w:t>
-      </w:r>
-      <w:r>
-        <w:rPr>
-          <w:rFonts w:ascii="Times New Roman" w:eastAsia="Times New Roman" w:hAnsi="Times New Roman" w:cs="Times New Roman"/>
-          <w:i/>
-          <w:iCs/>
-          <w:color w:val="000000" w:themeColor="text1"/>
-          <w:sz w:val="24"/>
-          <w:szCs w:val="24"/>
-          <w:lang w:val="en-BR" w:eastAsia="pt-BR"/>
-        </w:rPr>
-        <w:lastRenderedPageBreak/>
-        <w:t>Code</w:t>
+        <w:t>Policy as Code</w:t>
       </w:r>
       <w:r>
         <w:rPr>
@@ -2815,7 +4096,17 @@
           <w:szCs w:val="24"/>
           <w:lang w:val="en-BR"/>
         </w:rPr>
-        <w:t xml:space="preserve"> para a entrega de novos projetos, eliminando as esperas tradicionais associadas à abertura de chamados para operações (BEYER </w:t>
+        <w:t xml:space="preserve"> para a entrega de novos </w:t>
+      </w:r>
+      <w:r>
+        <w:rPr>
+          <w:rFonts w:ascii="Times New Roman" w:eastAsia="Times New Roman" w:hAnsi="Times New Roman" w:cs="Times New Roman"/>
+          <w:sz w:val="24"/>
+          <w:szCs w:val="24"/>
+          <w:lang w:val="en-BR"/>
+        </w:rPr>
+        <w:lastRenderedPageBreak/>
+        <w:t xml:space="preserve">projetos, eliminando as esperas tradicionais associadas à abertura de chamados para operações (BEYER </w:t>
       </w:r>
       <w:r>
         <w:rPr>
@@ -3246,19 +4537,7 @@
           <w:rPr>
             <w:rStyle w:val="Hyperlink"/>
           </w:rPr>
-          <w:t>https://land</w:t>
-        </w:r>
-        <w:r>
-          <w:rPr>
-            <w:rStyle w:val="Hyperlink"/>
-          </w:rPr>
-          <w:t>s</w:t>
-        </w:r>
-        <w:r>
-          <w:rPr>
-            <w:rStyle w:val="Hyperlink"/>
-          </w:rPr>
-          <w:t>cape.cncf.io/</w:t>
+          <w:t>https://landscape.cncf.io/</w:t>
         </w:r>
       </w:hyperlink>
       <w:r>
@@ -3288,19 +4567,7 @@
           <w:rPr>
             <w:rStyle w:val="Hyperlink"/>
           </w:rPr>
-          <w:t>https://crossplane.io/d</w:t>
-        </w:r>
-        <w:r>
-          <w:rPr>
-            <w:rStyle w:val="Hyperlink"/>
-          </w:rPr>
-          <w:t>o</w:t>
-        </w:r>
-        <w:r>
-          <w:rPr>
-            <w:rStyle w:val="Hyperlink"/>
-          </w:rPr>
-          <w:t>cs/</w:t>
+          <w:t>https://crossplane.io/docs/</w:t>
         </w:r>
       </w:hyperlink>
       <w:r>
@@ -3330,19 +4597,7 @@
           <w:rPr>
             <w:rStyle w:val="Hyperlink"/>
           </w:rPr>
-          <w:t>https://kyverno.io/d</w:t>
-        </w:r>
-        <w:r>
-          <w:rPr>
-            <w:rStyle w:val="Hyperlink"/>
-          </w:rPr>
-          <w:t>o</w:t>
-        </w:r>
-        <w:r>
-          <w:rPr>
-            <w:rStyle w:val="Hyperlink"/>
-          </w:rPr>
-          <w:t>cs/</w:t>
+          <w:t>https://kyverno.io/docs/</w:t>
         </w:r>
       </w:hyperlink>
       <w:r>
@@ -3372,19 +4627,7 @@
           <w:rPr>
             <w:rStyle w:val="Hyperlink"/>
           </w:rPr>
-          <w:t>https://lea</w:t>
-        </w:r>
-        <w:r>
-          <w:rPr>
-            <w:rStyle w:val="Hyperlink"/>
-          </w:rPr>
-          <w:t>r</w:t>
-        </w:r>
-        <w:r>
-          <w:rPr>
-            <w:rStyle w:val="Hyperlink"/>
-          </w:rPr>
-          <w:t>n.microsoft.com/pt-br/azure/aks/concepts-clusters-workloads</w:t>
+          <w:t>https://learn.microsoft.com/pt-br/azure/aks/concepts-clusters-workloads</w:t>
         </w:r>
       </w:hyperlink>
       <w:r>
@@ -3414,19 +4657,7 @@
           <w:rPr>
             <w:rStyle w:val="Hyperlink"/>
           </w:rPr>
-          <w:t>https://learn.microsoft.com/pt-br/azure/aks/csi-</w:t>
-        </w:r>
-        <w:r>
-          <w:rPr>
-            <w:rStyle w:val="Hyperlink"/>
-          </w:rPr>
-          <w:t>s</w:t>
-        </w:r>
-        <w:r>
-          <w:rPr>
-            <w:rStyle w:val="Hyperlink"/>
-          </w:rPr>
-          <w:t>ecrets-store-driver</w:t>
+          <w:t>https://learn.microsoft.com/pt-br/azure/aks/csi-secrets-store-driver</w:t>
         </w:r>
       </w:hyperlink>
       <w:r>
@@ -3480,19 +4711,7 @@
           <w:rPr>
             <w:rStyle w:val="Hyperlink"/>
           </w:rPr>
-          <w:t>https:</w:t>
-        </w:r>
-        <w:r>
-          <w:rPr>
-            <w:rStyle w:val="Hyperlink"/>
-          </w:rPr>
-          <w:t>/</w:t>
-        </w:r>
-        <w:r>
-          <w:rPr>
-            <w:rStyle w:val="Hyperlink"/>
-          </w:rPr>
-          <w:t>/backstage.io/docs/overview/what-is-backstage</w:t>
+          <w:t>https://backstage.io/docs/overview/what-is-backstage</w:t>
         </w:r>
       </w:hyperlink>
       <w:r>
@@ -3562,6 +4781,7 @@
         <w:docPartUnique/>
       </w:docPartObj>
     </w:sdtPr>
+    <w:sdtEndPr/>
     <w:sdtContent>
       <w:p>
         <w:pPr>
@@ -3640,7 +4860,7 @@
         <w:noProof/>
         <w:lang w:eastAsia="pt-BR"/>
       </w:rPr>
-      <w:pict w14:anchorId="15EEB7B1">
+      <w:pict w14:anchorId="7907B79A">
         <v:shapetype id="_x0000_t75" coordsize="21600,21600" o:spt="75" o:preferrelative="t" path="m@4@5l@4@11@9@11@9@5xe" filled="f" stroked="f">
           <v:stroke joinstyle="miter"/>
           <v:formulas>
@@ -3703,7 +4923,7 @@
         <w:noProof/>
         <w:lang w:eastAsia="pt-BR"/>
       </w:rPr>
-      <w:pict w14:anchorId="5678A063">
+      <w:pict w14:anchorId="3D0B9143">
         <v:shapetype id="_x0000_t75" coordsize="21600,21600" o:spt="75" o:preferrelative="t" path="m@4@5l@4@11@9@11@9@5xe" filled="f" stroked="f">
           <v:stroke joinstyle="miter"/>
           <v:formulas>
@@ -3885,6 +5105,155 @@
     </w:lvl>
   </w:abstractNum>
   <w:abstractNum w:abstractNumId="1" w15:restartNumberingAfterBreak="0">
+    <w:nsid w:val="13F97703"/>
+    <w:multiLevelType w:val="multilevel"/>
+    <w:tmpl w:val="EF588CEC"/>
+    <w:lvl w:ilvl="0">
+      <w:start w:val="1"/>
+      <w:numFmt w:val="bullet"/>
+      <w:lvlText w:val=""/>
+      <w:lvlJc w:val="left"/>
+      <w:pPr>
+        <w:tabs>
+          <w:tab w:val="num" w:pos="720"/>
+        </w:tabs>
+        <w:ind w:left="720" w:hanging="360"/>
+      </w:pPr>
+      <w:rPr>
+        <w:rFonts w:ascii="Symbol" w:hAnsi="Symbol" w:hint="default"/>
+        <w:sz w:val="20"/>
+      </w:rPr>
+    </w:lvl>
+    <w:lvl w:ilvl="1" w:tentative="1">
+      <w:start w:val="1"/>
+      <w:numFmt w:val="bullet"/>
+      <w:lvlText w:val="o"/>
+      <w:lvlJc w:val="left"/>
+      <w:pPr>
+        <w:tabs>
+          <w:tab w:val="num" w:pos="1440"/>
+        </w:tabs>
+        <w:ind w:left="1440" w:hanging="360"/>
+      </w:pPr>
+      <w:rPr>
+        <w:rFonts w:ascii="Courier New" w:hAnsi="Courier New" w:hint="default"/>
+        <w:sz w:val="20"/>
+      </w:rPr>
+    </w:lvl>
+    <w:lvl w:ilvl="2" w:tentative="1">
+      <w:start w:val="1"/>
+      <w:numFmt w:val="bullet"/>
+      <w:lvlText w:val=""/>
+      <w:lvlJc w:val="left"/>
+      <w:pPr>
+        <w:tabs>
+          <w:tab w:val="num" w:pos="2160"/>
+        </w:tabs>
+        <w:ind w:left="2160" w:hanging="360"/>
+      </w:pPr>
+      <w:rPr>
+        <w:rFonts w:ascii="Wingdings" w:hAnsi="Wingdings" w:hint="default"/>
+        <w:sz w:val="20"/>
+      </w:rPr>
+    </w:lvl>
+    <w:lvl w:ilvl="3" w:tentative="1">
+      <w:start w:val="1"/>
+      <w:numFmt w:val="bullet"/>
+      <w:lvlText w:val=""/>
+      <w:lvlJc w:val="left"/>
+      <w:pPr>
+        <w:tabs>
+          <w:tab w:val="num" w:pos="2880"/>
+        </w:tabs>
+        <w:ind w:left="2880" w:hanging="360"/>
+      </w:pPr>
+      <w:rPr>
+        <w:rFonts w:ascii="Wingdings" w:hAnsi="Wingdings" w:hint="default"/>
+        <w:sz w:val="20"/>
+      </w:rPr>
+    </w:lvl>
+    <w:lvl w:ilvl="4" w:tentative="1">
+      <w:start w:val="1"/>
+      <w:numFmt w:val="bullet"/>
+      <w:lvlText w:val=""/>
+      <w:lvlJc w:val="left"/>
+      <w:pPr>
+        <w:tabs>
+          <w:tab w:val="num" w:pos="3600"/>
+        </w:tabs>
+        <w:ind w:left="3600" w:hanging="360"/>
+      </w:pPr>
+      <w:rPr>
+        <w:rFonts w:ascii="Wingdings" w:hAnsi="Wingdings" w:hint="default"/>
+        <w:sz w:val="20"/>
+      </w:rPr>
+    </w:lvl>
+    <w:lvl w:ilvl="5" w:tentative="1">
+      <w:start w:val="1"/>
+      <w:numFmt w:val="bullet"/>
+      <w:lvlText w:val=""/>
+      <w:lvlJc w:val="left"/>
+      <w:pPr>
+        <w:tabs>
+          <w:tab w:val="num" w:pos="4320"/>
+        </w:tabs>
+        <w:ind w:left="4320" w:hanging="360"/>
+      </w:pPr>
+      <w:rPr>
+        <w:rFonts w:ascii="Wingdings" w:hAnsi="Wingdings" w:hint="default"/>
+        <w:sz w:val="20"/>
+      </w:rPr>
+    </w:lvl>
+    <w:lvl w:ilvl="6" w:tentative="1">
+      <w:start w:val="1"/>
+      <w:numFmt w:val="bullet"/>
+      <w:lvlText w:val=""/>
+      <w:lvlJc w:val="left"/>
+      <w:pPr>
+        <w:tabs>
+          <w:tab w:val="num" w:pos="5040"/>
+        </w:tabs>
+        <w:ind w:left="5040" w:hanging="360"/>
+      </w:pPr>
+      <w:rPr>
+        <w:rFonts w:ascii="Wingdings" w:hAnsi="Wingdings" w:hint="default"/>
+        <w:sz w:val="20"/>
+      </w:rPr>
+    </w:lvl>
+    <w:lvl w:ilvl="7" w:tentative="1">
+      <w:start w:val="1"/>
+      <w:numFmt w:val="bullet"/>
+      <w:lvlText w:val=""/>
+      <w:lvlJc w:val="left"/>
+      <w:pPr>
+        <w:tabs>
+          <w:tab w:val="num" w:pos="5760"/>
+        </w:tabs>
+        <w:ind w:left="5760" w:hanging="360"/>
+      </w:pPr>
+      <w:rPr>
+        <w:rFonts w:ascii="Wingdings" w:hAnsi="Wingdings" w:hint="default"/>
+        <w:sz w:val="20"/>
+      </w:rPr>
+    </w:lvl>
+    <w:lvl w:ilvl="8" w:tentative="1">
+      <w:start w:val="1"/>
+      <w:numFmt w:val="bullet"/>
+      <w:lvlText w:val=""/>
+      <w:lvlJc w:val="left"/>
+      <w:pPr>
+        <w:tabs>
+          <w:tab w:val="num" w:pos="6480"/>
+        </w:tabs>
+        <w:ind w:left="6480" w:hanging="360"/>
+      </w:pPr>
+      <w:rPr>
+        <w:rFonts w:ascii="Wingdings" w:hAnsi="Wingdings" w:hint="default"/>
+        <w:sz w:val="20"/>
+      </w:rPr>
+    </w:lvl>
+  </w:abstractNum>
+  <w:abstractNum w:abstractNumId="2" w15:restartNumberingAfterBreak="0">
     <w:nsid w:val="197A1FCD"/>
     <w:multiLevelType w:val="multilevel"/>
     <w:tmpl w:val="4F6A234A"/>
@@ -4001,7 +5370,93 @@
       </w:pPr>
     </w:lvl>
   </w:abstractNum>
-  <w:abstractNum w:abstractNumId="2" w15:restartNumberingAfterBreak="0">
+  <w:abstractNum w:abstractNumId="3" w15:restartNumberingAfterBreak="0">
+    <w:nsid w:val="30155146"/>
+    <w:multiLevelType w:val="hybridMultilevel"/>
+    <w:tmpl w:val="80BAD976"/>
+    <w:lvl w:ilvl="0" w:tplc="0409000F">
+      <w:start w:val="1"/>
+      <w:numFmt w:val="decimal"/>
+      <w:lvlText w:val="%1."/>
+      <w:lvlJc w:val="left"/>
+      <w:pPr>
+        <w:ind w:left="1210" w:hanging="360"/>
+      </w:pPr>
+    </w:lvl>
+    <w:lvl w:ilvl="1" w:tplc="04090019" w:tentative="1">
+      <w:start w:val="1"/>
+      <w:numFmt w:val="lowerLetter"/>
+      <w:lvlText w:val="%2."/>
+      <w:lvlJc w:val="left"/>
+      <w:pPr>
+        <w:ind w:left="1930" w:hanging="360"/>
+      </w:pPr>
+    </w:lvl>
+    <w:lvl w:ilvl="2" w:tplc="0409001B" w:tentative="1">
+      <w:start w:val="1"/>
+      <w:numFmt w:val="lowerRoman"/>
+      <w:lvlText w:val="%3."/>
+      <w:lvlJc w:val="right"/>
+      <w:pPr>
+        <w:ind w:left="2650" w:hanging="180"/>
+      </w:pPr>
+    </w:lvl>
+    <w:lvl w:ilvl="3" w:tplc="0409000F" w:tentative="1">
+      <w:start w:val="1"/>
+      <w:numFmt w:val="decimal"/>
+      <w:lvlText w:val="%4."/>
+      <w:lvlJc w:val="left"/>
+      <w:pPr>
+        <w:ind w:left="3370" w:hanging="360"/>
+      </w:pPr>
+    </w:lvl>
+    <w:lvl w:ilvl="4" w:tplc="04090019" w:tentative="1">
+      <w:start w:val="1"/>
+      <w:numFmt w:val="lowerLetter"/>
+      <w:lvlText w:val="%5."/>
+      <w:lvlJc w:val="left"/>
+      <w:pPr>
+        <w:ind w:left="4090" w:hanging="360"/>
+      </w:pPr>
+    </w:lvl>
+    <w:lvl w:ilvl="5" w:tplc="0409001B" w:tentative="1">
+      <w:start w:val="1"/>
+      <w:numFmt w:val="lowerRoman"/>
+      <w:lvlText w:val="%6."/>
+      <w:lvlJc w:val="right"/>
+      <w:pPr>
+        <w:ind w:left="4810" w:hanging="180"/>
+      </w:pPr>
+    </w:lvl>
+    <w:lvl w:ilvl="6" w:tplc="0409000F" w:tentative="1">
+      <w:start w:val="1"/>
+      <w:numFmt w:val="decimal"/>
+      <w:lvlText w:val="%7."/>
+      <w:lvlJc w:val="left"/>
+      <w:pPr>
+        <w:ind w:left="5530" w:hanging="360"/>
+      </w:pPr>
+    </w:lvl>
+    <w:lvl w:ilvl="7" w:tplc="04090019" w:tentative="1">
+      <w:start w:val="1"/>
+      <w:numFmt w:val="lowerLetter"/>
+      <w:lvlText w:val="%8."/>
+      <w:lvlJc w:val="left"/>
+      <w:pPr>
+        <w:ind w:left="6250" w:hanging="360"/>
+      </w:pPr>
+    </w:lvl>
+    <w:lvl w:ilvl="8" w:tplc="0409001B" w:tentative="1">
+      <w:start w:val="1"/>
+      <w:numFmt w:val="lowerRoman"/>
+      <w:lvlText w:val="%9."/>
+      <w:lvlJc w:val="right"/>
+      <w:pPr>
+        <w:ind w:left="6970" w:hanging="180"/>
+      </w:pPr>
+    </w:lvl>
+  </w:abstractNum>
+  <w:abstractNum w:abstractNumId="4" w15:restartNumberingAfterBreak="0">
     <w:nsid w:val="395C3858"/>
     <w:multiLevelType w:val="hybridMultilevel"/>
     <w:tmpl w:val="86C225D4"/>
@@ -4114,7 +5569,7 @@
       </w:rPr>
     </w:lvl>
   </w:abstractNum>
-  <w:abstractNum w:abstractNumId="3" w15:restartNumberingAfterBreak="0">
+  <w:abstractNum w:abstractNumId="5" w15:restartNumberingAfterBreak="0">
     <w:nsid w:val="3E406253"/>
     <w:multiLevelType w:val="multilevel"/>
     <w:tmpl w:val="CA444D70"/>
@@ -4263,7 +5718,7 @@
       </w:rPr>
     </w:lvl>
   </w:abstractNum>
-  <w:abstractNum w:abstractNumId="4" w15:restartNumberingAfterBreak="0">
+  <w:abstractNum w:abstractNumId="6" w15:restartNumberingAfterBreak="0">
     <w:nsid w:val="40D56693"/>
     <w:multiLevelType w:val="hybridMultilevel"/>
     <w:tmpl w:val="D6040B36"/>
@@ -4376,7 +5831,7 @@
       </w:rPr>
     </w:lvl>
   </w:abstractNum>
-  <w:abstractNum w:abstractNumId="5" w15:restartNumberingAfterBreak="0">
+  <w:abstractNum w:abstractNumId="7" w15:restartNumberingAfterBreak="0">
     <w:nsid w:val="41ED50D1"/>
     <w:multiLevelType w:val="hybridMultilevel"/>
     <w:tmpl w:val="404AB65C"/>
@@ -4489,7 +5944,7 @@
       </w:rPr>
     </w:lvl>
   </w:abstractNum>
-  <w:abstractNum w:abstractNumId="6" w15:restartNumberingAfterBreak="0">
+  <w:abstractNum w:abstractNumId="8" w15:restartNumberingAfterBreak="0">
     <w:nsid w:val="4D2F3748"/>
     <w:multiLevelType w:val="multilevel"/>
     <w:tmpl w:val="F9A6F670"/>
@@ -4602,7 +6057,7 @@
       </w:pPr>
     </w:lvl>
   </w:abstractNum>
-  <w:abstractNum w:abstractNumId="7" w15:restartNumberingAfterBreak="0">
+  <w:abstractNum w:abstractNumId="9" w15:restartNumberingAfterBreak="0">
     <w:nsid w:val="592363EE"/>
     <w:multiLevelType w:val="hybridMultilevel"/>
     <w:tmpl w:val="4656CE62"/>
@@ -4715,7 +6170,7 @@
       </w:rPr>
     </w:lvl>
   </w:abstractNum>
-  <w:abstractNum w:abstractNumId="8" w15:restartNumberingAfterBreak="0">
+  <w:abstractNum w:abstractNumId="10" w15:restartNumberingAfterBreak="0">
     <w:nsid w:val="59AB46B4"/>
     <w:multiLevelType w:val="hybridMultilevel"/>
     <w:tmpl w:val="3CB41EFA"/>
@@ -4828,7 +6283,7 @@
       </w:rPr>
     </w:lvl>
   </w:abstractNum>
-  <w:abstractNum w:abstractNumId="9" w15:restartNumberingAfterBreak="0">
+  <w:abstractNum w:abstractNumId="11" w15:restartNumberingAfterBreak="0">
     <w:nsid w:val="5C3D5708"/>
     <w:multiLevelType w:val="hybridMultilevel"/>
     <w:tmpl w:val="091CCC64"/>
@@ -4914,7 +6369,7 @@
       </w:pPr>
     </w:lvl>
   </w:abstractNum>
-  <w:abstractNum w:abstractNumId="10" w15:restartNumberingAfterBreak="0">
+  <w:abstractNum w:abstractNumId="12" w15:restartNumberingAfterBreak="0">
     <w:nsid w:val="64707322"/>
     <w:multiLevelType w:val="multilevel"/>
     <w:tmpl w:val="55FADDF0"/>
@@ -5063,7 +6518,7 @@
       </w:rPr>
     </w:lvl>
   </w:abstractNum>
-  <w:abstractNum w:abstractNumId="11" w15:restartNumberingAfterBreak="0">
+  <w:abstractNum w:abstractNumId="13" w15:restartNumberingAfterBreak="0">
     <w:nsid w:val="64D639B9"/>
     <w:multiLevelType w:val="multilevel"/>
     <w:tmpl w:val="520CF4F4"/>
@@ -5212,7 +6667,7 @@
       </w:rPr>
     </w:lvl>
   </w:abstractNum>
-  <w:abstractNum w:abstractNumId="12" w15:restartNumberingAfterBreak="0">
+  <w:abstractNum w:abstractNumId="14" w15:restartNumberingAfterBreak="0">
     <w:nsid w:val="69967C24"/>
     <w:multiLevelType w:val="hybridMultilevel"/>
     <w:tmpl w:val="8ABE3626"/>
@@ -5325,7 +6780,7 @@
       </w:rPr>
     </w:lvl>
   </w:abstractNum>
-  <w:abstractNum w:abstractNumId="13" w15:restartNumberingAfterBreak="0">
+  <w:abstractNum w:abstractNumId="15" w15:restartNumberingAfterBreak="0">
     <w:nsid w:val="6DCE438B"/>
     <w:multiLevelType w:val="hybridMultilevel"/>
     <w:tmpl w:val="F01C1F80"/>
@@ -5438,7 +6893,7 @@
       </w:rPr>
     </w:lvl>
   </w:abstractNum>
-  <w:abstractNum w:abstractNumId="14" w15:restartNumberingAfterBreak="0">
+  <w:abstractNum w:abstractNumId="16" w15:restartNumberingAfterBreak="0">
     <w:nsid w:val="71411416"/>
     <w:multiLevelType w:val="hybridMultilevel"/>
     <w:tmpl w:val="9D96F526"/>
@@ -5551,7 +7006,96 @@
       </w:rPr>
     </w:lvl>
   </w:abstractNum>
-  <w:abstractNum w:abstractNumId="15" w15:restartNumberingAfterBreak="0">
+  <w:abstractNum w:abstractNumId="17" w15:restartNumberingAfterBreak="0">
+    <w:nsid w:val="7D0156A0"/>
+    <w:multiLevelType w:val="hybridMultilevel"/>
+    <w:tmpl w:val="3AF8BD56"/>
+    <w:lvl w:ilvl="0" w:tplc="04090017">
+      <w:start w:val="1"/>
+      <w:numFmt w:val="lowerLetter"/>
+      <w:lvlText w:val="%1)"/>
+      <w:lvlJc w:val="left"/>
+      <w:pPr>
+        <w:ind w:left="720" w:hanging="360"/>
+      </w:pPr>
+      <w:rPr>
+        <w:rFonts w:hint="default"/>
+      </w:rPr>
+    </w:lvl>
+    <w:lvl w:ilvl="1" w:tplc="04090019" w:tentative="1">
+      <w:start w:val="1"/>
+      <w:numFmt w:val="lowerLetter"/>
+      <w:lvlText w:val="%2."/>
+      <w:lvlJc w:val="left"/>
+      <w:pPr>
+        <w:ind w:left="1440" w:hanging="360"/>
+      </w:pPr>
+    </w:lvl>
+    <w:lvl w:ilvl="2" w:tplc="0409001B" w:tentative="1">
+      <w:start w:val="1"/>
+      <w:numFmt w:val="lowerRoman"/>
+      <w:lvlText w:val="%3."/>
+      <w:lvlJc w:val="right"/>
+      <w:pPr>
+        <w:ind w:left="2160" w:hanging="180"/>
+      </w:pPr>
+    </w:lvl>
+    <w:lvl w:ilvl="3" w:tplc="0409000F" w:tentative="1">
+      <w:start w:val="1"/>
+      <w:numFmt w:val="decimal"/>
+      <w:lvlText w:val="%4."/>
+      <w:lvlJc w:val="left"/>
+      <w:pPr>
+        <w:ind w:left="2880" w:hanging="360"/>
+      </w:pPr>
+    </w:lvl>
+    <w:lvl w:ilvl="4" w:tplc="04090019" w:tentative="1">
+      <w:start w:val="1"/>
+      <w:numFmt w:val="lowerLetter"/>
+      <w:lvlText w:val="%5."/>
+      <w:lvlJc w:val="left"/>
+      <w:pPr>
+        <w:ind w:left="3600" w:hanging="360"/>
+      </w:pPr>
+    </w:lvl>
+    <w:lvl w:ilvl="5" w:tplc="0409001B" w:tentative="1">
+      <w:start w:val="1"/>
+      <w:numFmt w:val="lowerRoman"/>
+      <w:lvlText w:val="%6."/>
+      <w:lvlJc w:val="right"/>
+      <w:pPr>
+        <w:ind w:left="4320" w:hanging="180"/>
+      </w:pPr>
+    </w:lvl>
+    <w:lvl w:ilvl="6" w:tplc="0409000F" w:tentative="1">
+      <w:start w:val="1"/>
+      <w:numFmt w:val="decimal"/>
+      <w:lvlText w:val="%7."/>
+      <w:lvlJc w:val="left"/>
+      <w:pPr>
+        <w:ind w:left="5040" w:hanging="360"/>
+      </w:pPr>
+    </w:lvl>
+    <w:lvl w:ilvl="7" w:tplc="04090019" w:tentative="1">
+      <w:start w:val="1"/>
+      <w:numFmt w:val="lowerLetter"/>
+      <w:lvlText w:val="%8."/>
+      <w:lvlJc w:val="left"/>
+      <w:pPr>
+        <w:ind w:left="5760" w:hanging="360"/>
+      </w:pPr>
+    </w:lvl>
+    <w:lvl w:ilvl="8" w:tplc="0409001B" w:tentative="1">
+      <w:start w:val="1"/>
+      <w:numFmt w:val="lowerRoman"/>
+      <w:lvlText w:val="%9."/>
+      <w:lvlJc w:val="right"/>
+      <w:pPr>
+        <w:ind w:left="6480" w:hanging="180"/>
+      </w:pPr>
+    </w:lvl>
+  </w:abstractNum>
+  <w:abstractNum w:abstractNumId="18" w15:restartNumberingAfterBreak="0">
     <w:nsid w:val="7F55225D"/>
     <w:multiLevelType w:val="multilevel"/>
     <w:tmpl w:val="2734628A"/>
@@ -5665,52 +7209,61 @@
     </w:lvl>
   </w:abstractNum>
   <w:num w:numId="1" w16cid:durableId="379213197">
-    <w:abstractNumId w:val="7"/>
+    <w:abstractNumId w:val="9"/>
   </w:num>
   <w:num w:numId="2" w16cid:durableId="1715226273">
-    <w:abstractNumId w:val="15"/>
+    <w:abstractNumId w:val="18"/>
   </w:num>
   <w:num w:numId="3" w16cid:durableId="1421291498">
-    <w:abstractNumId w:val="12"/>
+    <w:abstractNumId w:val="14"/>
   </w:num>
   <w:num w:numId="4" w16cid:durableId="2063019439">
     <w:abstractNumId w:val="0"/>
   </w:num>
   <w:num w:numId="5" w16cid:durableId="1623539055">
+    <w:abstractNumId w:val="8"/>
+  </w:num>
+  <w:num w:numId="6" w16cid:durableId="1881933038">
+    <w:abstractNumId w:val="13"/>
+  </w:num>
+  <w:num w:numId="7" w16cid:durableId="286661505">
+    <w:abstractNumId w:val="11"/>
+  </w:num>
+  <w:num w:numId="8" w16cid:durableId="1882477211">
+    <w:abstractNumId w:val="12"/>
+  </w:num>
+  <w:num w:numId="9" w16cid:durableId="487674538">
+    <w:abstractNumId w:val="5"/>
+  </w:num>
+  <w:num w:numId="10" w16cid:durableId="1775057831">
+    <w:abstractNumId w:val="4"/>
+  </w:num>
+  <w:num w:numId="11" w16cid:durableId="1668554536">
+    <w:abstractNumId w:val="16"/>
+  </w:num>
+  <w:num w:numId="12" w16cid:durableId="1850021733">
     <w:abstractNumId w:val="6"/>
   </w:num>
-  <w:num w:numId="6" w16cid:durableId="1881933038">
-    <w:abstractNumId w:val="11"/>
+  <w:num w:numId="13" w16cid:durableId="1607231537">
+    <w:abstractNumId w:val="15"/>
   </w:num>
-  <w:num w:numId="7" w16cid:durableId="286661505">
-    <w:abstractNumId w:val="9"/>
+  <w:num w:numId="14" w16cid:durableId="812596739">
+    <w:abstractNumId w:val="7"/>
   </w:num>
-  <w:num w:numId="8" w16cid:durableId="1882477211">
+  <w:num w:numId="15" w16cid:durableId="447315745">
     <w:abstractNumId w:val="10"/>
   </w:num>
-  <w:num w:numId="9" w16cid:durableId="487674538">
+  <w:num w:numId="16" w16cid:durableId="749042463">
+    <w:abstractNumId w:val="2"/>
+  </w:num>
+  <w:num w:numId="17" w16cid:durableId="1771731743">
+    <w:abstractNumId w:val="1"/>
+  </w:num>
+  <w:num w:numId="18" w16cid:durableId="2069448115">
     <w:abstractNumId w:val="3"/>
   </w:num>
-  <w:num w:numId="10" w16cid:durableId="1775057831">
-    <w:abstractNumId w:val="2"/>
-  </w:num>
-  <w:num w:numId="11" w16cid:durableId="1668554536">
-    <w:abstractNumId w:val="14"/>
-  </w:num>
-  <w:num w:numId="12" w16cid:durableId="1850021733">
-    <w:abstractNumId w:val="4"/>
-  </w:num>
-  <w:num w:numId="13" w16cid:durableId="1607231537">
-    <w:abstractNumId w:val="13"/>
-  </w:num>
-  <w:num w:numId="14" w16cid:durableId="812596739">
-    <w:abstractNumId w:val="5"/>
-  </w:num>
-  <w:num w:numId="15" w16cid:durableId="447315745">
-    <w:abstractNumId w:val="8"/>
-  </w:num>
-  <w:num w:numId="16" w16cid:durableId="749042463">
-    <w:abstractNumId w:val="1"/>
+  <w:num w:numId="19" w16cid:durableId="659502747">
+    <w:abstractNumId w:val="17"/>
   </w:num>
 </w:numbering>
 </file>
@@ -6817,21 +8370,6 @@
 </file>
 
 <file path=customXml/item1.xml><?xml version="1.0" encoding="utf-8"?>
-<p:properties xmlns:p="http://schemas.microsoft.com/office/2006/metadata/properties" xmlns:xsi="http://www.w3.org/2001/XMLSchema-instance" xmlns:pc="http://schemas.microsoft.com/office/infopath/2007/PartnerControls">
-  <documentManagement/>
-</p:properties>
-</file>
-
-<file path=customXml/item2.xml><?xml version="1.0" encoding="utf-8"?>
-<?mso-contentType ?>
-<FormTemplates xmlns="http://schemas.microsoft.com/sharepoint/v3/contenttype/forms">
-  <Display>DocumentLibraryForm</Display>
-  <Edit>DocumentLibraryForm</Edit>
-  <New>DocumentLibraryForm</New>
-</FormTemplates>
-</file>
-
-<file path=customXml/item3.xml><?xml version="1.0" encoding="utf-8"?>
 <ct:contentTypeSchema xmlns:ct="http://schemas.microsoft.com/office/2006/metadata/contentType" xmlns:ma="http://schemas.microsoft.com/office/2006/metadata/properties/metaAttributes" ct:_="" ma:_="" ma:contentTypeName="Document" ma:contentTypeID="0x010100E1E2AEE6422D1B4480E7B3B63DBF7893" ma:contentTypeVersion="12" ma:contentTypeDescription="Create a new document." ma:contentTypeScope="" ma:versionID="7771be0b5356c4890d219dfb62d01cb9">
   <xsd:schema xmlns:xsd="http://www.w3.org/2001/XMLSchema" xmlns:xs="http://www.w3.org/2001/XMLSchema" xmlns:p="http://schemas.microsoft.com/office/2006/metadata/properties" xmlns:ns2="ad840e82-c1e2-4f62-98ea-f170fed6d9f0" xmlns:ns3="e9332686-6632-45c5-8292-529675b83208" targetNamespace="http://schemas.microsoft.com/office/2006/metadata/properties" ma:root="true" ma:fieldsID="d377feeb807a9dda45b9f6230ec2d604" ns2:_="" ns3:_="">
     <xsd:import namespace="ad840e82-c1e2-4f62-98ea-f170fed6d9f0"/>
@@ -7048,24 +8586,22 @@
 </ct:contentTypeSchema>
 </file>
 
-<file path=customXml/itemProps1.xml><?xml version="1.0" encoding="utf-8"?>
-<ds:datastoreItem xmlns:ds="http://schemas.openxmlformats.org/officeDocument/2006/customXml" ds:itemID="{6F6DFC47-F813-4586-A92E-F921BCC2C8CD}">
-  <ds:schemaRefs>
-    <ds:schemaRef ds:uri="http://schemas.microsoft.com/office/2006/metadata/properties"/>
-    <ds:schemaRef ds:uri="http://schemas.microsoft.com/office/infopath/2007/PartnerControls"/>
-  </ds:schemaRefs>
-</ds:datastoreItem>
+<file path=customXml/item2.xml><?xml version="1.0" encoding="utf-8"?>
+<p:properties xmlns:p="http://schemas.microsoft.com/office/2006/metadata/properties" xmlns:xsi="http://www.w3.org/2001/XMLSchema-instance" xmlns:pc="http://schemas.microsoft.com/office/infopath/2007/PartnerControls">
+  <documentManagement/>
+</p:properties>
 </file>
 
-<file path=customXml/itemProps2.xml><?xml version="1.0" encoding="utf-8"?>
-<ds:datastoreItem xmlns:ds="http://schemas.openxmlformats.org/officeDocument/2006/customXml" ds:itemID="{A080799D-B01C-4216-9B7C-7DA6FA8AF4E8}">
-  <ds:schemaRefs>
-    <ds:schemaRef ds:uri="http://schemas.microsoft.com/sharepoint/v3/contenttype/forms"/>
-  </ds:schemaRefs>
-</ds:datastoreItem>
+<file path=customXml/item3.xml><?xml version="1.0" encoding="utf-8"?>
+<?mso-contentType ?>
+<FormTemplates xmlns="http://schemas.microsoft.com/sharepoint/v3/contenttype/forms">
+  <Display>DocumentLibraryForm</Display>
+  <Edit>DocumentLibraryForm</Edit>
+  <New>DocumentLibraryForm</New>
+</FormTemplates>
 </file>
 
-<file path=customXml/itemProps3.xml><?xml version="1.0" encoding="utf-8"?>
+<file path=customXml/itemProps1.xml><?xml version="1.0" encoding="utf-8"?>
 <ds:datastoreItem xmlns:ds="http://schemas.openxmlformats.org/officeDocument/2006/customXml" ds:itemID="{26AC7263-3C58-4E36-A68C-46AB5D7DEE47}">
   <ds:schemaRefs>
     <ds:schemaRef ds:uri="http://schemas.microsoft.com/office/2006/metadata/contentType"/>
@@ -7082,4 +8618,21 @@
     <ds:schemaRef ds:uri="http://schemas.microsoft.com/internal/obd"/>
   </ds:schemaRefs>
 </ds:datastoreItem>
+</file>
+
+<file path=customXml/itemProps2.xml><?xml version="1.0" encoding="utf-8"?>
+<ds:datastoreItem xmlns:ds="http://schemas.openxmlformats.org/officeDocument/2006/customXml" ds:itemID="{6F6DFC47-F813-4586-A92E-F921BCC2C8CD}">
+  <ds:schemaRefs>
+    <ds:schemaRef ds:uri="http://schemas.microsoft.com/office/2006/metadata/properties"/>
+    <ds:schemaRef ds:uri="http://schemas.microsoft.com/office/infopath/2007/PartnerControls"/>
+  </ds:schemaRefs>
+</ds:datastoreItem>
+</file>
+
+<file path=customXml/itemProps3.xml><?xml version="1.0" encoding="utf-8"?>
+<ds:datastoreItem xmlns:ds="http://schemas.openxmlformats.org/officeDocument/2006/customXml" ds:itemID="{A080799D-B01C-4216-9B7C-7DA6FA8AF4E8}">
+  <ds:schemaRefs>
+    <ds:schemaRef ds:uri="http://schemas.microsoft.com/sharepoint/v3/contenttype/forms"/>
+  </ds:schemaRefs>
+</ds:datastoreItem>
 </file>
</xml_diff>